<commit_message>
feat(usp71): support optional prepper in narratives and smart_personnel_block, and optimize date calculations
</commit_message>
<xml_diff>
--- a/USP71 OOS P1 template.docx
+++ b/USP71 OOS P1 template.docx
@@ -777,6 +777,7 @@
                 <w:szCs w:val="22"/>
               </w:rPr>
             </w:pPr>
+            <w:bookmarkStart w:id="3" w:name="OLE_LINK26"/>
             <w:proofErr w:type="gramStart"/>
             <w:r>
               <w:rPr>
@@ -858,6 +859,7 @@
               <w:t>}</w:t>
             </w:r>
           </w:p>
+          <w:bookmarkEnd w:id="3"/>
           <w:p>
             <w:pPr>
               <w:rPr>
@@ -2196,7 +2198,7 @@
                 </w:ffData>
               </w:fldChar>
             </w:r>
-            <w:bookmarkStart w:id="3" w:name="Check1"/>
+            <w:bookmarkStart w:id="4" w:name="Check1"/>
             <w:r>
               <w:rPr>
                 <w:rFonts w:ascii="Times New Roman" w:hAnsi="Times New Roman"/>
@@ -2232,7 +2234,7 @@
               </w:rPr>
               <w:fldChar w:fldCharType="end"/>
             </w:r>
-            <w:bookmarkEnd w:id="3"/>
+            <w:bookmarkEnd w:id="4"/>
             <w:r>
               <w:rPr>
                 <w:rFonts w:ascii="Times New Roman" w:hAnsi="Times New Roman"/>
@@ -4114,7 +4116,7 @@
                 <w:szCs w:val="22"/>
               </w:rPr>
             </w:pPr>
-            <w:bookmarkStart w:id="4" w:name="OLE_LINK14"/>
+            <w:bookmarkStart w:id="5" w:name="OLE_LINK14"/>
             <w:r>
               <w:rPr>
                 <w:rFonts w:ascii="Times New Roman" w:hAnsi="Times New Roman"/>
@@ -4139,7 +4141,7 @@
               </w:rPr>
               <w:t xml:space="preserve"> analysts are trained and qualified by quality to perform the test.</w:t>
             </w:r>
-            <w:bookmarkEnd w:id="4"/>
+            <w:bookmarkEnd w:id="5"/>
           </w:p>
         </w:tc>
       </w:tr>
@@ -21599,19 +21601,6 @@
 </file>
 
 <file path=customXml/item1.xml><?xml version="1.0" encoding="utf-8"?>
-<?mso-contentType ?>
-<FormTemplates xmlns="http://schemas.microsoft.com/sharepoint/v3/contenttype/forms">
-  <Display>DocumentLibraryForm</Display>
-  <Edit>DocumentLibraryForm</Edit>
-  <New>DocumentLibraryForm</New>
-</FormTemplates>
-</file>
-
-<file path=customXml/item2.xml><?xml version="1.0" encoding="utf-8"?>
-<b:Sources xmlns:b="http://schemas.openxmlformats.org/officeDocument/2006/bibliography" xmlns="http://schemas.openxmlformats.org/officeDocument/2006/bibliography" SelectedStyle="\APA.XSL" StyleName="APA"/>
-</file>
-
-<file path=customXml/item3.xml><?xml version="1.0" encoding="utf-8"?>
 <ct:contentTypeSchema xmlns:ct="http://schemas.microsoft.com/office/2006/metadata/contentType" xmlns:ma="http://schemas.microsoft.com/office/2006/metadata/properties/metaAttributes" ct:_="" ma:_="" ma:contentTypeName="Document" ma:contentTypeID="0x010100FB737B7133867847B545A083BFAC78EF" ma:contentTypeVersion="12" ma:contentTypeDescription="Create a new document." ma:contentTypeScope="" ma:versionID="3a7982f5d2373b82eed64d91a9f1640e">
   <xsd:schema xmlns:xsd="http://www.w3.org/2001/XMLSchema" xmlns:xs="http://www.w3.org/2001/XMLSchema" xmlns:p="http://schemas.microsoft.com/office/2006/metadata/properties" xmlns:ns2="77e63d64-5ec0-4c26-bf73-c24d6b7abddf" xmlns:ns3="005d0a5f-c6b0-470f-85f2-ee975d36b3d6" targetNamespace="http://schemas.microsoft.com/office/2006/metadata/properties" ma:root="true" ma:fieldsID="2763948d00d98a9e1e6be9e3b1352800" ns2:_="" ns3:_="">
     <xsd:import namespace="77e63d64-5ec0-4c26-bf73-c24d6b7abddf"/>
@@ -21828,6 +21817,19 @@
 </ct:contentTypeSchema>
 </file>
 
+<file path=customXml/item2.xml><?xml version="1.0" encoding="utf-8"?>
+<b:Sources xmlns:b="http://schemas.openxmlformats.org/officeDocument/2006/bibliography" xmlns="http://schemas.openxmlformats.org/officeDocument/2006/bibliography" SelectedStyle="\APA.XSL" StyleName="APA"/>
+</file>
+
+<file path=customXml/item3.xml><?xml version="1.0" encoding="utf-8"?>
+<?mso-contentType ?>
+<FormTemplates xmlns="http://schemas.microsoft.com/sharepoint/v3/contenttype/forms">
+  <Display>DocumentLibraryForm</Display>
+  <Edit>DocumentLibraryForm</Edit>
+  <New>DocumentLibraryForm</New>
+</FormTemplates>
+</file>
+
 <file path=customXml/item4.xml><?xml version="1.0" encoding="utf-8"?>
 <p:properties xmlns:p="http://schemas.microsoft.com/office/2006/metadata/properties" xmlns:xsi="http://www.w3.org/2001/XMLSchema-instance" xmlns:pc="http://schemas.microsoft.com/office/infopath/2007/PartnerControls">
   <documentManagement/>
@@ -21835,22 +21837,6 @@
 </file>
 
 <file path=customXml/itemProps1.xml><?xml version="1.0" encoding="utf-8"?>
-<ds:datastoreItem xmlns:ds="http://schemas.openxmlformats.org/officeDocument/2006/customXml" ds:itemID="{E711A312-DD48-45F6-BA88-B896F55D6DB7}">
-  <ds:schemaRefs>
-    <ds:schemaRef ds:uri="http://schemas.microsoft.com/sharepoint/v3/contenttype/forms"/>
-  </ds:schemaRefs>
-</ds:datastoreItem>
-</file>
-
-<file path=customXml/itemProps2.xml><?xml version="1.0" encoding="utf-8"?>
-<ds:datastoreItem xmlns:ds="http://schemas.openxmlformats.org/officeDocument/2006/customXml" ds:itemID="{308E1B35-0FAF-4A78-BEF3-82256463C83E}">
-  <ds:schemaRefs>
-    <ds:schemaRef ds:uri="http://schemas.openxmlformats.org/officeDocument/2006/bibliography"/>
-  </ds:schemaRefs>
-</ds:datastoreItem>
-</file>
-
-<file path=customXml/itemProps3.xml><?xml version="1.0" encoding="utf-8"?>
 <ds:datastoreItem xmlns:ds="http://schemas.openxmlformats.org/officeDocument/2006/customXml" ds:itemID="{F69EE333-7533-4C7F-8CBF-50CC15A694A4}">
   <ds:schemaRefs>
     <ds:schemaRef ds:uri="http://schemas.microsoft.com/office/2006/metadata/contentType"/>
@@ -21869,6 +21855,22 @@
 </ds:datastoreItem>
 </file>
 
+<file path=customXml/itemProps2.xml><?xml version="1.0" encoding="utf-8"?>
+<ds:datastoreItem xmlns:ds="http://schemas.openxmlformats.org/officeDocument/2006/customXml" ds:itemID="{308E1B35-0FAF-4A78-BEF3-82256463C83E}">
+  <ds:schemaRefs>
+    <ds:schemaRef ds:uri="http://schemas.openxmlformats.org/officeDocument/2006/bibliography"/>
+  </ds:schemaRefs>
+</ds:datastoreItem>
+</file>
+
+<file path=customXml/itemProps3.xml><?xml version="1.0" encoding="utf-8"?>
+<ds:datastoreItem xmlns:ds="http://schemas.openxmlformats.org/officeDocument/2006/customXml" ds:itemID="{E711A312-DD48-45F6-BA88-B896F55D6DB7}">
+  <ds:schemaRefs>
+    <ds:schemaRef ds:uri="http://schemas.microsoft.com/sharepoint/v3/contenttype/forms"/>
+  </ds:schemaRefs>
+</ds:datastoreItem>
+</file>
+
 <file path=customXml/itemProps4.xml><?xml version="1.0" encoding="utf-8"?>
 <ds:datastoreItem xmlns:ds="http://schemas.openxmlformats.org/officeDocument/2006/customXml" ds:itemID="{DD86B631-EF59-42E0-AFBB-4D6A49D52145}">
   <ds:schemaRefs>

</xml_diff>

<commit_message>
chore(usp71): update word template and reverse render script to align text styling and paragraph blocks
</commit_message>
<xml_diff>
--- a/USP71 OOS P1 template.docx
+++ b/USP71 OOS P1 template.docx
@@ -164,20 +164,53 @@
             <w:pPr>
               <w:outlineLvl w:val="0"/>
               <w:rPr>
-                <w:rFonts w:ascii="Times New Roman" w:hAnsi="Times New Roman"/>
-                <w:bCs/>
-                <w:sz w:val="22"/>
-                <w:szCs w:val="22"/>
-              </w:rPr>
-            </w:pPr>
-            <w:r>
-              <w:rPr>
-                <w:rFonts w:ascii="Times New Roman" w:hAnsi="Times New Roman"/>
-                <w:bCs/>
-                <w:sz w:val="22"/>
-                <w:szCs w:val="22"/>
-              </w:rPr>
-              <w:t>{{ analyst_signature }}</w:t>
+                <w:rFonts w:ascii="Times New Roman" w:eastAsiaTheme="minorEastAsia" w:hAnsi="Times New Roman"/>
+                <w:bCs/>
+                <w:sz w:val="22"/>
+                <w:szCs w:val="22"/>
+                <w:lang w:eastAsia="zh-CN"/>
+              </w:rPr>
+            </w:pPr>
+            <w:r>
+              <w:rPr>
+                <w:rFonts w:ascii="Times New Roman" w:hAnsi="Times New Roman"/>
+                <w:bCs/>
+                <w:sz w:val="22"/>
+                <w:szCs w:val="22"/>
+              </w:rPr>
+              <w:t xml:space="preserve"/>
+            </w:r>
+          </w:p>
+          <w:p>
+            <w:pPr>
+              <w:outlineLvl w:val="0"/>
+              <w:rPr>
+                <w:rFonts w:ascii="Times New Roman" w:eastAsiaTheme="minorEastAsia" w:hAnsi="Times New Roman"/>
+                <w:bCs/>
+                <w:sz w:val="22"/>
+                <w:szCs w:val="22"/>
+                <w:lang w:eastAsia="zh-CN"/>
+              </w:rPr>
+            </w:pPr>
+          </w:p>
+          <w:p>
+            <w:pPr>
+              <w:outlineLvl w:val="0"/>
+              <w:rPr>
+                <w:rFonts w:ascii="Times New Roman" w:hAnsi="Times New Roman"/>
+                <w:bCs/>
+                <w:sz w:val="22"/>
+                <w:szCs w:val="22"/>
+              </w:rPr>
+            </w:pPr>
+            <w:r>
+              <w:rPr>
+                <w:rFonts w:ascii="Times New Roman" w:hAnsi="Times New Roman"/>
+                <w:bCs/>
+                <w:sz w:val="22"/>
+                <w:szCs w:val="22"/>
+              </w:rPr>
+              <w:t>(Written by: Qiyue Chen)</w:t>
             </w:r>
           </w:p>
         </w:tc>
@@ -204,7 +237,7 @@
                 <w:sz w:val="22"/>
                 <w:szCs w:val="22"/>
               </w:rPr>
-              <w:t>Test Date:</w:t>
+              <w:t xml:space="preserve">Test Date:</w:t>
             </w:r>
           </w:p>
         </w:tc>
@@ -223,36 +256,16 @@
                 <w:szCs w:val="22"/>
               </w:rPr>
             </w:pPr>
-            <w:bookmarkStart w:id="0" w:name="OLE_LINK25"/>
-            <w:r>
-              <w:rPr>
-                <w:rFonts w:ascii="Times New Roman" w:hAnsi="Times New Roman"/>
-                <w:bCs/>
-                <w:sz w:val="22"/>
-                <w:szCs w:val="22"/>
-              </w:rPr>
-              <w:t xml:space="preserve">{{ </w:t>
-            </w:r>
-            <w:r>
-              <w:rPr>
-                <w:rFonts w:ascii="Times New Roman" w:hAnsi="Times New Roman"/>
-                <w:bCs/>
-                <w:sz w:val="22"/>
-                <w:szCs w:val="22"/>
-              </w:rPr>
-              <w:t>process</w:t>
-            </w:r>
-            <w:r>
-              <w:rPr>
-                <w:rFonts w:ascii="Times New Roman" w:hAnsi="Times New Roman"/>
-                <w:bCs/>
-                <w:sz w:val="22"/>
-                <w:szCs w:val="22"/>
-              </w:rPr>
-              <w:t>_date }}</w:t>
-            </w:r>
-          </w:p>
-          <w:bookmarkEnd w:id="0"/>
+            <w:r>
+              <w:rPr>
+                <w:rFonts w:ascii="Times New Roman" w:hAnsi="Times New Roman"/>
+                <w:bCs/>
+                <w:sz w:val="22"/>
+                <w:szCs w:val="22"/>
+              </w:rPr>
+              <w:t xml:space="preserve"/>
+            </w:r>
+          </w:p>
           <w:p>
             <w:pPr>
               <w:outlineLvl w:val="0"/>
@@ -307,18 +320,18 @@
                 <w:szCs w:val="22"/>
               </w:rPr>
             </w:pPr>
-            <w:bookmarkStart w:id="1" w:name="OLE_LINK24"/>
-            <w:r>
-              <w:rPr>
-                <w:rFonts w:ascii="Times New Roman" w:hAnsi="Times New Roman"/>
-                <w:bCs/>
-                <w:sz w:val="22"/>
-                <w:szCs w:val="22"/>
-              </w:rPr>
-              <w:t>{{ test_date }}</w:t>
-            </w:r>
-          </w:p>
-          <w:bookmarkEnd w:id="1"/>
+            <w:bookmarkStart w:id="0" w:name="OLE_LINK17"/>
+            <w:r>
+              <w:rPr>
+                <w:rFonts w:ascii="Times New Roman" w:hAnsi="Times New Roman"/>
+                <w:bCs/>
+                <w:sz w:val="22"/>
+                <w:szCs w:val="22"/>
+              </w:rPr>
+              <w:t xml:space="preserve"/>
+            </w:r>
+          </w:p>
+          <w:bookmarkEnd w:id="0"/>
           <w:p>
             <w:pPr>
               <w:outlineLvl w:val="0"/>
@@ -383,7 +396,7 @@
                 <w:sz w:val="22"/>
                 <w:szCs w:val="22"/>
               </w:rPr>
-              <w:t>{{ test_date }}</w:t>
+              <w:t xml:space="preserve"/>
             </w:r>
           </w:p>
           <w:p>
@@ -439,35 +452,8 @@
                 <w:szCs w:val="22"/>
               </w:rPr>
             </w:pPr>
-            <w:bookmarkStart w:id="2" w:name="OLE_LINK5"/>
-            <w:r>
-              <w:rPr>
-                <w:rFonts w:ascii="Times New Roman" w:eastAsiaTheme="minorEastAsia" w:hAnsi="Times New Roman" w:hint="eastAsia"/>
-                <w:bCs/>
-                <w:sz w:val="22"/>
-                <w:szCs w:val="22"/>
-                <w:lang w:eastAsia="zh-CN"/>
-              </w:rPr>
-              <w:t>USP71</w:t>
-            </w:r>
-            <w:r>
-              <w:rPr>
-                <w:rFonts w:ascii="Times New Roman" w:hAnsi="Times New Roman"/>
-                <w:bCs/>
-                <w:sz w:val="22"/>
-                <w:szCs w:val="22"/>
-              </w:rPr>
-              <w:t xml:space="preserve"> Sterility</w:t>
-            </w:r>
-            <w:bookmarkEnd w:id="2"/>
-            <w:r>
-              <w:rPr>
-                <w:rFonts w:ascii="Times New Roman" w:hAnsi="Times New Roman"/>
-                <w:bCs/>
-                <w:sz w:val="22"/>
-                <w:szCs w:val="22"/>
-              </w:rPr>
-              <w:t xml:space="preserve"> Test</w:t>
+            <w:r>
+              <w:t>USP &lt;71&gt; Sterility Test</w:t>
             </w:r>
           </w:p>
         </w:tc>
@@ -522,14 +508,50 @@
                 <w:lang w:eastAsia="zh-CN"/>
               </w:rPr>
             </w:pPr>
-            <w:r>
-              <w:rPr>
-                <w:rFonts w:ascii="Times New Roman" w:hAnsi="Times New Roman"/>
-                <w:bCs/>
-                <w:sz w:val="22"/>
-                <w:szCs w:val="22"/>
-              </w:rPr>
-              <w:t>{{ report_header }}</w:t>
+            <w:bookmarkStart w:id="1" w:name="OLE_LINK16"/>
+            <w:r>
+              <w:rPr>
+                <w:rFonts w:ascii="Times New Roman" w:hAnsi="Times New Roman"/>
+                <w:bCs/>
+                <w:sz w:val="22"/>
+                <w:szCs w:val="22"/>
+              </w:rPr>
+              <w:t xml:space="preserve"/>
+            </w:r>
+          </w:p>
+          <w:bookmarkEnd w:id="1"/>
+          <w:p>
+            <w:pPr>
+              <w:outlineLvl w:val="0"/>
+              <w:rPr>
+                <w:rFonts w:ascii="Times New Roman" w:eastAsiaTheme="minorEastAsia" w:hAnsi="Times New Roman"/>
+                <w:bCs/>
+                <w:sz w:val="22"/>
+                <w:szCs w:val="22"/>
+                <w:lang w:eastAsia="zh-CN"/>
+              </w:rPr>
+            </w:pPr>
+          </w:p>
+          <w:p>
+            <w:pPr>
+              <w:outlineLvl w:val="0"/>
+              <w:rPr>
+                <w:rFonts w:ascii="Times New Roman" w:eastAsiaTheme="minorEastAsia" w:hAnsi="Times New Roman"/>
+                <w:bCs/>
+                <w:sz w:val="22"/>
+                <w:szCs w:val="22"/>
+                <w:lang w:eastAsia="zh-CN"/>
+              </w:rPr>
+            </w:pPr>
+            <w:r>
+              <w:rPr>
+                <w:rFonts w:ascii="Times New Roman" w:eastAsiaTheme="minorEastAsia" w:hAnsi="Times New Roman"/>
+                <w:bCs/>
+                <w:sz w:val="22"/>
+                <w:szCs w:val="22"/>
+                <w:lang w:eastAsia="zh-CN"/>
+              </w:rPr>
+              <w:t xml:space="preserve"/>
             </w:r>
           </w:p>
         </w:tc>
@@ -580,16 +602,153 @@
                 <w:szCs w:val="22"/>
               </w:rPr>
             </w:pPr>
-            <w:bookmarkStart w:id="3" w:name="OLE_LINK26"/>
-            <w:r>
-              <w:rPr>
-                <w:rFonts w:ascii="Times New Roman" w:hAnsi="Times New Roman"/>
-                <w:bCs/>
-                <w:sz w:val="22"/>
-                <w:szCs w:val="22"/>
-              </w:rPr>
-              <w:t>{{</w:t>
-            </w:r>
+            <w:r>
+              <w:rPr>
+                <w:rFonts w:ascii="Times New Roman" w:hAnsi="Times New Roman"/>
+                <w:bCs/>
+                <w:sz w:val="22"/>
+                <w:szCs w:val="22"/>
+              </w:rPr>
+              <w:t xml:space="preserve">Prepper: </w:t>
+            </w:r>
+          </w:p>
+          <w:p>
+            <w:pPr>
+              <w:outlineLvl w:val="0"/>
+              <w:rPr>
+                <w:rFonts w:ascii="Times New Roman" w:hAnsi="Times New Roman"/>
+                <w:bCs/>
+                <w:sz w:val="22"/>
+                <w:szCs w:val="22"/>
+              </w:rPr>
+            </w:pPr>
+            <w:r>
+              <w:rPr>
+                <w:rFonts w:ascii="Times New Roman" w:hAnsi="Times New Roman"/>
+                <w:bCs/>
+                <w:sz w:val="22"/>
+                <w:szCs w:val="22"/>
+              </w:rPr>
+              <w:t xml:space="preserve"/>
+            </w:r>
+            <w:r>
+              <w:rPr>
+                <w:rFonts w:ascii="Times New Roman" w:hAnsi="Times New Roman"/>
+                <w:bCs/>
+                <w:sz w:val="22"/>
+                <w:szCs w:val="22"/>
+              </w:rPr>
+              <w:t xml:space="preserve"> </w:t>
+            </w:r>
+            <w:r>
+              <w:rPr>
+                <w:rFonts w:ascii="Times New Roman" w:hAnsi="Times New Roman"/>
+                <w:bCs/>
+                <w:sz w:val="22"/>
+                <w:szCs w:val="22"/>
+              </w:rPr>
+              <w:t xml:space="preserve">(</w:t>
+            </w:r>
+            <w:r>
+              <w:rPr>
+                <w:rFonts w:ascii="Times New Roman" w:hAnsi="Times New Roman"/>
+                <w:bCs/>
+                <w:sz w:val="22"/>
+                <w:szCs w:val="22"/>
+              </w:rPr>
+              <w:t xml:space="preserve">)</w:t>
+            </w:r>
+          </w:p>
+          <w:p>
+            <w:pPr>
+              <w:outlineLvl w:val="0"/>
+              <w:rPr>
+                <w:rFonts w:ascii="Times New Roman" w:hAnsi="Times New Roman"/>
+                <w:bCs/>
+                <w:sz w:val="22"/>
+                <w:szCs w:val="22"/>
+              </w:rPr>
+            </w:pPr>
+          </w:p>
+          <w:p>
+            <w:pPr>
+              <w:outlineLvl w:val="0"/>
+              <w:rPr>
+                <w:rFonts w:ascii="Times New Roman" w:hAnsi="Times New Roman"/>
+                <w:bCs/>
+                <w:sz w:val="22"/>
+                <w:szCs w:val="22"/>
+              </w:rPr>
+            </w:pPr>
+            <w:r>
+              <w:rPr>
+                <w:rFonts w:ascii="Times New Roman" w:hAnsi="Times New Roman"/>
+                <w:bCs/>
+                <w:sz w:val="22"/>
+                <w:szCs w:val="22"/>
+              </w:rPr>
+              <w:t>Processor:</w:t>
+            </w:r>
+          </w:p>
+          <w:p>
+            <w:pPr>
+              <w:rPr>
+                <w:rFonts w:ascii="Times New Roman" w:hAnsi="Times New Roman"/>
+                <w:bCs/>
+                <w:sz w:val="22"/>
+                <w:szCs w:val="22"/>
+              </w:rPr>
+            </w:pPr>
+            <w:r>
+              <w:rPr>
+                <w:rFonts w:ascii="Times New Roman" w:hAnsi="Times New Roman"/>
+                <w:bCs/>
+                <w:sz w:val="22"/>
+                <w:szCs w:val="22"/>
+              </w:rPr>
+              <w:t xml:space="preserve"/>
+            </w:r>
+            <w:r>
+              <w:rPr>
+                <w:rFonts w:ascii="Times New Roman" w:hAnsi="Times New Roman"/>
+                <w:bCs/>
+                <w:sz w:val="22"/>
+                <w:szCs w:val="22"/>
+              </w:rPr>
+              <w:t xml:space="preserve"> (</w:t>
+            </w:r>
+            <w:r>
+              <w:rPr>
+                <w:rFonts w:ascii="Times New Roman" w:hAnsi="Times New Roman"/>
+                <w:bCs/>
+                <w:sz w:val="22"/>
+                <w:szCs w:val="22"/>
+              </w:rPr>
+              <w:t xml:space="preserve">)</w:t>
+            </w:r>
+          </w:p>
+          <w:p>
+            <w:pPr>
+              <w:outlineLvl w:val="0"/>
+              <w:rPr>
+                <w:rFonts w:ascii="Times New Roman" w:eastAsiaTheme="minorEastAsia" w:hAnsi="Times New Roman"/>
+                <w:bCs/>
+                <w:sz w:val="22"/>
+                <w:szCs w:val="22"/>
+                <w:lang w:eastAsia="zh-CN"/>
+              </w:rPr>
+            </w:pPr>
+          </w:p>
+          <w:p>
+            <w:pPr>
+              <w:outlineLvl w:val="0"/>
+              <w:rPr>
+                <w:rFonts w:ascii="Times New Roman" w:hAnsi="Times New Roman"/>
+                <w:bCs/>
+                <w:sz w:val="22"/>
+                <w:szCs w:val="22"/>
+              </w:rPr>
+            </w:pPr>
             <w:r>
               <w:rPr>
                 <w:rFonts w:ascii="Times New Roman" w:eastAsiaTheme="minorEastAsia" w:hAnsi="Times New Roman" w:hint="eastAsia"/>
@@ -598,47 +757,140 @@
                 <w:szCs w:val="22"/>
                 <w:lang w:eastAsia="zh-CN"/>
               </w:rPr>
+              <w:t xml:space="preserve">Subculture </w:t>
+            </w:r>
+            <w:r>
+              <w:rPr>
+                <w:rFonts w:ascii="Times New Roman" w:hAnsi="Times New Roman"/>
+                <w:bCs/>
+                <w:sz w:val="22"/>
+                <w:szCs w:val="22"/>
+              </w:rPr>
+              <w:t>Processor:</w:t>
+            </w:r>
+          </w:p>
+          <w:p>
+            <w:pPr>
+              <w:rPr>
+                <w:rFonts w:ascii="Times New Roman" w:hAnsi="Times New Roman"/>
+                <w:bCs/>
+                <w:sz w:val="22"/>
+                <w:szCs w:val="22"/>
+              </w:rPr>
+            </w:pPr>
+            <w:r>
+              <w:t xml:space="preserve"> ()</w:t>
+            </w:r>
+          </w:p>
+          <w:p>
+            <w:pPr>
+              <w:outlineLvl w:val="0"/>
+              <w:rPr>
+                <w:rFonts w:ascii="Times New Roman" w:eastAsiaTheme="minorEastAsia" w:hAnsi="Times New Roman"/>
+                <w:bCs/>
+                <w:sz w:val="22"/>
+                <w:szCs w:val="22"/>
+                <w:lang w:eastAsia="zh-CN"/>
+              </w:rPr>
+            </w:pPr>
+          </w:p>
+          <w:p>
+            <w:pPr>
+              <w:outlineLvl w:val="0"/>
+              <w:rPr>
+                <w:rFonts w:ascii="Times New Roman" w:hAnsi="Times New Roman"/>
+                <w:bCs/>
+                <w:sz w:val="22"/>
+                <w:szCs w:val="22"/>
+              </w:rPr>
+            </w:pPr>
+            <w:r>
+              <w:rPr>
+                <w:rFonts w:ascii="Times New Roman" w:hAnsi="Times New Roman"/>
+                <w:bCs/>
+                <w:sz w:val="22"/>
+                <w:szCs w:val="22"/>
+              </w:rPr>
+              <w:t>Reading</w:t>
+            </w:r>
+            <w:r>
+              <w:rPr>
+                <w:rFonts w:ascii="Times New Roman" w:hAnsi="Times New Roman"/>
+                <w:bCs/>
+                <w:sz w:val="22"/>
+                <w:szCs w:val="22"/>
+              </w:rPr>
               <w:t xml:space="preserve"> </w:t>
             </w:r>
             <w:r>
               <w:rPr>
-                <w:rFonts w:ascii="Times New Roman" w:hAnsi="Times New Roman"/>
-                <w:bCs/>
-                <w:sz w:val="22"/>
-                <w:szCs w:val="22"/>
-              </w:rPr>
-              <w:t>smart_personnel_block</w:t>
-            </w:r>
-            <w:r>
-              <w:rPr>
                 <w:rFonts w:ascii="Times New Roman" w:eastAsiaTheme="minorEastAsia" w:hAnsi="Times New Roman" w:hint="eastAsia"/>
                 <w:bCs/>
                 <w:sz w:val="22"/>
                 <w:szCs w:val="22"/>
                 <w:lang w:eastAsia="zh-CN"/>
               </w:rPr>
+              <w:t>Analyst</w:t>
+            </w:r>
+            <w:r>
+              <w:rPr>
+                <w:rFonts w:ascii="Times New Roman" w:hAnsi="Times New Roman"/>
+                <w:bCs/>
+                <w:sz w:val="22"/>
+                <w:szCs w:val="22"/>
+              </w:rPr>
+              <w:t xml:space="preserve">:</w:t>
+            </w:r>
+          </w:p>
+          <w:p>
+            <w:pPr>
+              <w:outlineLvl w:val="0"/>
+              <w:rPr>
+                <w:rFonts w:ascii="Times New Roman" w:eastAsiaTheme="minorEastAsia" w:hAnsi="Times New Roman"/>
+                <w:bCs/>
+                <w:sz w:val="22"/>
+                <w:szCs w:val="22"/>
+                <w:lang w:eastAsia="zh-CN"/>
+              </w:rPr>
+            </w:pPr>
+            <w:bookmarkStart w:id="3" w:name="OLE_LINK18"/>
+            <w:r>
+              <w:rPr>
+                <w:rFonts w:ascii="Times New Roman" w:hAnsi="Times New Roman"/>
+                <w:bCs/>
+                <w:sz w:val="22"/>
+                <w:szCs w:val="22"/>
+              </w:rPr>
+              <w:t xml:space="preserve"/>
+            </w:r>
+            <w:r>
+              <w:rPr>
+                <w:rFonts w:ascii="Times New Roman" w:hAnsi="Times New Roman"/>
+                <w:bCs/>
+                <w:sz w:val="22"/>
+                <w:szCs w:val="22"/>
+              </w:rPr>
               <w:t xml:space="preserve"> </w:t>
             </w:r>
-            <w:r>
-              <w:rPr>
-                <w:rFonts w:ascii="Times New Roman" w:hAnsi="Times New Roman"/>
-                <w:bCs/>
-                <w:sz w:val="22"/>
-                <w:szCs w:val="22"/>
-              </w:rPr>
-              <w:t>}}</w:t>
-            </w:r>
-          </w:p>
-          <w:bookmarkEnd w:id="3"/>
-          <w:p>
-            <w:pPr>
-              <w:rPr>
-                <w:rFonts w:ascii="Times New Roman" w:hAnsi="Times New Roman"/>
-                <w:bCs/>
-                <w:sz w:val="22"/>
-                <w:szCs w:val="22"/>
-              </w:rPr>
-            </w:pPr>
+            <w:bookmarkEnd w:id="3"/>
+            <w:r>
+              <w:rPr>
+                <w:rFonts w:ascii="Times New Roman" w:hAnsi="Times New Roman"/>
+                <w:bCs/>
+                <w:sz w:val="22"/>
+                <w:szCs w:val="22"/>
+              </w:rPr>
+              <w:t xml:space="preserve">(</w:t>
+            </w:r>
+            <w:r>
+              <w:rPr>
+                <w:rFonts w:ascii="Times New Roman" w:hAnsi="Times New Roman"/>
+                <w:bCs/>
+                <w:sz w:val="22"/>
+                <w:szCs w:val="22"/>
+              </w:rPr>
+              <w:t xml:space="preserve">)</w:t>
+            </w:r>
           </w:p>
         </w:tc>
         <w:tc>
@@ -690,7 +942,7 @@
                 <w:sz w:val="22"/>
                 <w:szCs w:val="22"/>
               </w:rPr>
-              <w:t>{{ sample_name }}</w:t>
+              <w:t xml:space="preserve"/>
             </w:r>
           </w:p>
         </w:tc>
@@ -745,7 +997,7 @@
                 <w:sz w:val="22"/>
                 <w:szCs w:val="22"/>
               </w:rPr>
-              <w:t>{{ lot_number }}</w:t>
+              <w:t xml:space="preserve"/>
             </w:r>
           </w:p>
         </w:tc>
@@ -839,7 +1091,7 @@
                 <w:sz w:val="22"/>
                 <w:szCs w:val="22"/>
               </w:rPr>
-              <w:t>{{ dosage_form}}</w:t>
+              <w:t xml:space="preserve"/>
             </w:r>
           </w:p>
         </w:tc>
@@ -926,7 +1178,7 @@
                 <w:sz w:val="22"/>
                 <w:szCs w:val="22"/>
               </w:rPr>
-              <w:t>Incident:</w:t>
+              <w:t xml:space="preserve">Incident:</w:t>
             </w:r>
           </w:p>
         </w:tc>
@@ -939,23 +1191,42 @@
             <w:pPr>
               <w:outlineLvl w:val="0"/>
               <w:rPr>
-                <w:rFonts w:ascii="Times New Roman" w:hAnsi="Times New Roman"/>
+                <w:rFonts w:ascii="Times New Roman" w:eastAsiaTheme="minorEastAsia" w:hAnsi="Times New Roman"/>
+                <w:bCs/>
+                <w:sz w:val="22"/>
+                <w:szCs w:val="22"/>
+                <w:lang w:eastAsia="zh-CN"/>
+              </w:rPr>
+            </w:pPr>
+            <w:r>
+              <w:t xml:space="preserve">On , sample  was found positive for viable microorganisms after USP &lt;71&gt; sterility testing. </w:t>
+            </w:r>
+          </w:p>
+          <w:p>
+            <w:pPr>
+              <w:outlineLvl w:val="0"/>
+              <w:rPr>
+                <w:rFonts w:ascii="Times New Roman" w:eastAsiaTheme="minorEastAsia" w:hAnsi="Times New Roman"/>
+                <w:bCs/>
+                <w:sz w:val="22"/>
+                <w:szCs w:val="22"/>
+                <w:lang w:eastAsia="zh-CN"/>
+              </w:rPr>
+            </w:pPr>
+          </w:p>
+          <w:p>
+            <w:pPr>
+              <w:outlineLvl w:val="0"/>
+              <w:rPr>
+                <w:rFonts w:ascii="Times New Roman" w:eastAsiaTheme="minorEastAsia" w:hAnsi="Times New Roman"/>
                 <w:bCs/>
                 <w:color w:val="000000"/>
                 <w:sz w:val="22"/>
                 <w:szCs w:val="22"/>
                 <w:shd w:val="clear" w:color="auto" w:fill="FFFFFF"/>
-              </w:rPr>
-            </w:pPr>
-            <w:r>
-              <w:rPr>
-                <w:rFonts w:ascii="Times New Roman" w:hAnsi="Times New Roman"/>
-                <w:bCs/>
-                <w:sz w:val="22"/>
-                <w:szCs w:val="22"/>
-              </w:rPr>
-              <w:t>{{ smart_incident_opening }}</w:t>
-            </w:r>
+                <w:lang w:eastAsia="zh-CN"/>
+              </w:rPr>
+            </w:pPr>
           </w:p>
         </w:tc>
         <w:tc>
@@ -1258,111 +1529,17 @@
                 <w:sz w:val="22"/>
                 <w:szCs w:val="22"/>
               </w:rPr>
-              <w:t>2.600.</w:t>
-            </w:r>
-            <w:r>
-              <w:rPr>
-                <w:rFonts w:ascii="Times New Roman" w:hAnsi="Times New Roman"/>
-                <w:bCs/>
-                <w:sz w:val="22"/>
-                <w:szCs w:val="22"/>
-              </w:rPr>
-              <w:t>0</w:t>
-            </w:r>
-            <w:r>
-              <w:rPr>
-                <w:rFonts w:ascii="Times New Roman" w:hAnsi="Times New Roman"/>
-                <w:bCs/>
-                <w:sz w:val="22"/>
-                <w:szCs w:val="22"/>
-              </w:rPr>
-              <w:t>23 (</w:t>
-            </w:r>
-            <w:r>
-              <w:rPr>
-                <w:rFonts w:ascii="Times New Roman" w:hAnsi="Times New Roman"/>
-                <w:bCs/>
-                <w:sz w:val="22"/>
-                <w:szCs w:val="22"/>
-              </w:rPr>
-              <w:t>10</w:t>
-            </w:r>
-            <w:r>
-              <w:rPr>
-                <w:rFonts w:ascii="Times New Roman" w:hAnsi="Times New Roman"/>
-                <w:bCs/>
-                <w:sz w:val="22"/>
-                <w:szCs w:val="22"/>
-              </w:rPr>
-              <w:t>)</w:t>
-            </w:r>
-          </w:p>
-          <w:p>
-            <w:pPr>
-              <w:outlineLvl w:val="0"/>
-              <w:rPr>
-                <w:rFonts w:ascii="Times New Roman" w:hAnsi="Times New Roman"/>
-                <w:bCs/>
-                <w:sz w:val="22"/>
-                <w:szCs w:val="22"/>
-              </w:rPr>
-            </w:pPr>
-            <w:r>
-              <w:rPr>
-                <w:rFonts w:ascii="Times New Roman" w:hAnsi="Times New Roman"/>
-                <w:bCs/>
-                <w:sz w:val="22"/>
-                <w:szCs w:val="22"/>
-              </w:rPr>
-              <w:t>2.700.0</w:t>
-            </w:r>
-            <w:r>
-              <w:rPr>
-                <w:rFonts w:ascii="Times New Roman" w:hAnsi="Times New Roman"/>
-                <w:bCs/>
-                <w:sz w:val="22"/>
-                <w:szCs w:val="22"/>
-              </w:rPr>
-              <w:t>0</w:t>
-            </w:r>
-            <w:r>
-              <w:rPr>
-                <w:rFonts w:ascii="Times New Roman" w:hAnsi="Times New Roman"/>
-                <w:bCs/>
-                <w:sz w:val="22"/>
-                <w:szCs w:val="22"/>
-              </w:rPr>
-              <w:t>4 (0</w:t>
-            </w:r>
-            <w:r>
-              <w:rPr>
-                <w:rFonts w:ascii="Times New Roman" w:hAnsi="Times New Roman"/>
-                <w:bCs/>
-                <w:sz w:val="22"/>
-                <w:szCs w:val="22"/>
-              </w:rPr>
-              <w:t>3</w:t>
-            </w:r>
-            <w:r>
-              <w:rPr>
-                <w:rFonts w:ascii="Times New Roman" w:hAnsi="Times New Roman"/>
-                <w:bCs/>
-                <w:sz w:val="22"/>
-                <w:szCs w:val="22"/>
-              </w:rPr>
-              <w:t>)</w:t>
-            </w:r>
-          </w:p>
-          <w:p>
-            <w:pPr>
-              <w:outlineLvl w:val="0"/>
-              <w:rPr>
-                <w:rFonts w:ascii="Times New Roman" w:hAnsi="Times New Roman"/>
-                <w:bCs/>
-                <w:sz w:val="22"/>
-                <w:szCs w:val="22"/>
-              </w:rPr>
-            </w:pPr>
+              <w:t>2.600.059</w:t>
+            </w:r>
+            <w:r>
+              <w:rPr>
+                <w:rFonts w:ascii="Times New Roman" w:hAnsi="Times New Roman"/>
+                <w:bCs/>
+                <w:sz w:val="22"/>
+                <w:szCs w:val="22"/>
+              </w:rPr>
+              <w:t xml:space="preserve"> (01)</w:t>
+            </w:r>
           </w:p>
         </w:tc>
         <w:tc>
@@ -1407,27 +1584,7 @@
                 <w:sz w:val="22"/>
                 <w:szCs w:val="22"/>
               </w:rPr>
-              <w:t>07Apr25</w:t>
-            </w:r>
-          </w:p>
-          <w:p>
-            <w:pPr>
-              <w:outlineLvl w:val="0"/>
-              <w:rPr>
-                <w:rFonts w:ascii="Times New Roman" w:hAnsi="Times New Roman"/>
-                <w:bCs/>
-                <w:sz w:val="22"/>
-                <w:szCs w:val="22"/>
-              </w:rPr>
-            </w:pPr>
-            <w:r>
-              <w:rPr>
-                <w:rFonts w:ascii="Times New Roman" w:hAnsi="Times New Roman"/>
-                <w:bCs/>
-                <w:sz w:val="22"/>
-                <w:szCs w:val="22"/>
-              </w:rPr>
-              <w:t>02Jan23</w:t>
+              <w:t>03Jan25</w:t>
             </w:r>
           </w:p>
         </w:tc>
@@ -1455,7 +1612,7 @@
                 <w:sz w:val="22"/>
                 <w:szCs w:val="22"/>
               </w:rPr>
-              <w:t xml:space="preserve">SOP / Test Method Rev: </w:t>
+              <w:t>SOP / Test</w:t>
             </w:r>
             <w:r>
               <w:rPr>
@@ -1465,7 +1622,7 @@
                 <w:sz w:val="22"/>
                 <w:szCs w:val="22"/>
               </w:rPr>
-              <w:t>10</w:t>
+              <w:t>:</w:t>
             </w:r>
           </w:p>
           <w:p>
@@ -1497,7 +1654,7 @@
                 <w:sz w:val="22"/>
                 <w:szCs w:val="22"/>
               </w:rPr>
-              <w:t>3</w:t>
+              <w:t>1</w:t>
             </w:r>
           </w:p>
         </w:tc>
@@ -1676,7 +1833,7 @@
                 <w:sz w:val="22"/>
                 <w:szCs w:val="22"/>
               </w:rPr>
-              <w:t>{{ test_date }}</w:t>
+              <w:t xml:space="preserve"/>
             </w:r>
           </w:p>
           <w:p>
@@ -2029,7 +2186,7 @@
                 <w:sz w:val="22"/>
                 <w:szCs w:val="22"/>
               </w:rPr>
-              <w:t>Analyst interviewed?</w:t>
+              <w:t xml:space="preserve">Analyst interviewed?</w:t>
             </w:r>
           </w:p>
         </w:tc>
@@ -2239,22 +2396,124 @@
           </w:tcPr>
           <w:p>
             <w:pPr>
-              <w:jc w:val="center"/>
-              <w:outlineLvl w:val="0"/>
-              <w:rPr>
-                <w:rFonts w:ascii="Times New Roman" w:hAnsi="Times New Roman"/>
-                <w:bCs/>
-                <w:sz w:val="22"/>
-                <w:szCs w:val="22"/>
-              </w:rPr>
-            </w:pPr>
-            <w:r>
-              <w:rPr>
-                <w:rFonts w:ascii="Times New Roman" w:hAnsi="Times New Roman"/>
-                <w:sz w:val="22"/>
-                <w:szCs w:val="22"/>
-              </w:rPr>
-              <w:t>{{ smart_comment_interview }}</w:t>
+              <w:outlineLvl w:val="0"/>
+              <w:rPr>
+                <w:rFonts w:ascii="Times New Roman" w:hAnsi="Times New Roman"/>
+                <w:bCs/>
+                <w:sz w:val="22"/>
+                <w:szCs w:val="22"/>
+              </w:rPr>
+            </w:pPr>
+            <w:r>
+              <w:rPr>
+                <w:rFonts w:ascii="Times New Roman" w:hAnsi="Times New Roman"/>
+                <w:sz w:val="22"/>
+                <w:szCs w:val="22"/>
+              </w:rPr>
+              <w:t xml:space="preserve">Yes, </w:t>
+            </w:r>
+            <w:bookmarkStart w:id="5" w:name="OLE_LINK1"/>
+            <w:r>
+              <w:rPr>
+                <w:rFonts w:ascii="Times New Roman" w:hAnsi="Times New Roman"/>
+                <w:sz w:val="22"/>
+                <w:szCs w:val="22"/>
+              </w:rPr>
+              <w:t xml:space="preserve">analysts </w:t>
+            </w:r>
+            <w:bookmarkStart w:id="6" w:name="OLE_LINK25"/>
+            <w:r>
+              <w:rPr>
+                <w:rFonts w:ascii="Times New Roman" w:hAnsi="Times New Roman"/>
+                <w:bCs/>
+                <w:sz w:val="22"/>
+                <w:szCs w:val="22"/>
+              </w:rPr>
+              <w:t xml:space="preserve">, </w:t>
+            </w:r>
+            <w:r>
+              <w:rPr>
+                <w:rFonts w:ascii="Times New Roman" w:hAnsi="Times New Roman"/>
+                <w:bCs/>
+                <w:sz w:val="22"/>
+                <w:szCs w:val="22"/>
+              </w:rPr>
+              <w:t xml:space="preserve"/>
+            </w:r>
+            <w:r>
+              <w:rPr>
+                <w:rFonts w:ascii="Times New Roman" w:hAnsi="Times New Roman"/>
+                <w:bCs/>
+                <w:sz w:val="22"/>
+                <w:szCs w:val="22"/>
+              </w:rPr>
+              <w:t xml:space="preserve">, </w:t>
+            </w:r>
+            <w:r>
+              <w:rPr>
+                <w:rFonts w:ascii="Times New Roman" w:hAnsi="Times New Roman"/>
+                <w:bCs/>
+                <w:sz w:val="22"/>
+                <w:szCs w:val="22"/>
+              </w:rPr>
+              <w:t xml:space="preserve"/>
+            </w:r>
+            <w:r>
+              <w:rPr>
+                <w:rFonts w:ascii="Times New Roman" w:eastAsiaTheme="minorEastAsia" w:hAnsi="Times New Roman" w:hint="eastAsia"/>
+                <w:bCs/>
+                <w:sz w:val="22"/>
+                <w:szCs w:val="22"/>
+                <w:lang w:eastAsia="zh-CN"/>
+              </w:rPr>
+              <w:t xml:space="preserve">, </w:t>
+            </w:r>
+            <w:r>
+              <w:rPr>
+                <w:rFonts w:ascii="Times New Roman" w:eastAsiaTheme="minorEastAsia" w:hAnsi="Times New Roman" w:hint="eastAsia"/>
+                <w:bCs/>
+                <w:sz w:val="22"/>
+                <w:szCs w:val="22"/>
+                <w:lang w:eastAsia="zh-CN"/>
+              </w:rPr>
+              <w:t xml:space="preserve">and </w:t>
+            </w:r>
+            <w:r>
+              <w:rPr>
+                <w:rFonts w:ascii="Times New Roman" w:hAnsi="Times New Roman"/>
+                <w:bCs/>
+                <w:sz w:val="22"/>
+                <w:szCs w:val="22"/>
+              </w:rPr>
+              <w:t xml:space="preserve"> </w:t>
+            </w:r>
+            <w:bookmarkEnd w:id="5"/>
+            <w:bookmarkEnd w:id="6"/>
+            <w:r>
+              <w:rPr>
+                <w:rFonts w:ascii="Times New Roman" w:hAnsi="Times New Roman"/>
+                <w:sz w:val="22"/>
+                <w:szCs w:val="22"/>
+              </w:rPr>
+              <w:t xml:space="preserve">were </w:t>
+            </w:r>
+            <w:r>
+              <w:rPr>
+                <w:rFonts w:ascii="Times New Roman" w:hAnsi="Times New Roman"/>
+                <w:bCs/>
+                <w:sz w:val="22"/>
+                <w:szCs w:val="22"/>
+              </w:rPr>
+              <w:t>interviewed comprehensively</w:t>
+            </w:r>
+            <w:r>
+              <w:rPr>
+                <w:rFonts w:ascii="Times New Roman" w:hAnsi="Times New Roman"/>
+                <w:bCs/>
+                <w:sz w:val="22"/>
+                <w:szCs w:val="22"/>
+              </w:rPr>
+              <w:t>.</w:t>
             </w:r>
           </w:p>
         </w:tc>
@@ -2510,7 +2769,34 @@
                 <w:sz w:val="22"/>
                 <w:szCs w:val="22"/>
               </w:rPr>
-              <w:t>{{ smart_comment_samples }}</w:t>
+              <w:t xml:space="preserve">Yes, </w:t>
+            </w:r>
+            <w:r>
+              <w:rPr>
+                <w:rFonts w:ascii="Times New Roman" w:hAnsi="Times New Roman"/>
+                <w:bCs/>
+                <w:sz w:val="22"/>
+                <w:szCs w:val="22"/>
+              </w:rPr>
+              <w:t xml:space="preserve">sample ID: </w:t>
+            </w:r>
+            <w:r>
+              <w:rPr>
+                <w:rFonts w:ascii="Times New Roman" w:hAnsi="Times New Roman"/>
+                <w:bCs/>
+                <w:sz w:val="22"/>
+                <w:szCs w:val="22"/>
+              </w:rPr>
+              <w:t xml:space="preserve"/>
+            </w:r>
+            <w:r>
+              <w:rPr>
+                <w:rFonts w:ascii="Times New Roman" w:hAnsi="Times New Roman"/>
+                <w:bCs/>
+                <w:sz w:val="22"/>
+                <w:szCs w:val="22"/>
+              </w:rPr>
+              <w:t xml:space="preserve"> </w:t>
             </w:r>
           </w:p>
         </w:tc>
@@ -2765,63 +3051,31 @@
                 <w:sz w:val="22"/>
                 <w:szCs w:val="22"/>
               </w:rPr>
-              <w:t xml:space="preserve">Yes, as per SOP </w:t>
-            </w:r>
-            <w:r>
-              <w:rPr>
-                <w:rFonts w:ascii="Times New Roman" w:hAnsi="Times New Roman"/>
-                <w:sz w:val="22"/>
-                <w:szCs w:val="22"/>
-              </w:rPr>
-              <w:t>2.600.</w:t>
-            </w:r>
-            <w:r>
-              <w:rPr>
-                <w:rFonts w:ascii="Times New Roman" w:hAnsi="Times New Roman"/>
-                <w:sz w:val="22"/>
-                <w:szCs w:val="22"/>
-              </w:rPr>
-              <w:t>0</w:t>
-            </w:r>
-            <w:r>
-              <w:rPr>
-                <w:rFonts w:ascii="Times New Roman" w:hAnsi="Times New Roman"/>
-                <w:sz w:val="22"/>
-                <w:szCs w:val="22"/>
-              </w:rPr>
-              <w:t>23</w:t>
-            </w:r>
-            <w:r>
-              <w:rPr>
-                <w:rFonts w:ascii="Times New Roman" w:hAnsi="Times New Roman"/>
-                <w:sz w:val="22"/>
-                <w:szCs w:val="22"/>
-              </w:rPr>
-              <w:t xml:space="preserve">, </w:t>
-            </w:r>
-            <w:r>
-              <w:rPr>
-                <w:rFonts w:ascii="Times New Roman" w:hAnsi="Times New Roman"/>
-                <w:sz w:val="22"/>
-                <w:szCs w:val="22"/>
-              </w:rPr>
-              <w:t>2.700.0</w:t>
-            </w:r>
-            <w:r>
-              <w:rPr>
-                <w:rFonts w:ascii="Times New Roman" w:hAnsi="Times New Roman"/>
-                <w:sz w:val="22"/>
-                <w:szCs w:val="22"/>
-              </w:rPr>
-              <w:t>0</w:t>
-            </w:r>
-            <w:r>
-              <w:rPr>
-                <w:rFonts w:ascii="Times New Roman" w:hAnsi="Times New Roman"/>
-                <w:sz w:val="22"/>
-                <w:szCs w:val="22"/>
-              </w:rPr>
-              <w:t>4</w:t>
+              <w:t>Yes, as per SOP</w:t>
+            </w:r>
+            <w:r>
+              <w:rPr>
+                <w:rFonts w:ascii="Times New Roman" w:hAnsi="Times New Roman"/>
+                <w:sz w:val="22"/>
+                <w:szCs w:val="22"/>
+              </w:rPr>
+              <w:t>#</w:t>
+            </w:r>
+            <w:r>
+              <w:rPr>
+                <w:rFonts w:ascii="Times New Roman" w:hAnsi="Times New Roman"/>
+                <w:sz w:val="22"/>
+                <w:szCs w:val="22"/>
+              </w:rPr>
+              <w:t xml:space="preserve"> </w:t>
+            </w:r>
+            <w:r>
+              <w:rPr>
+                <w:rFonts w:ascii="Times New Roman" w:hAnsi="Times New Roman"/>
+                <w:sz w:val="22"/>
+                <w:szCs w:val="22"/>
+              </w:rPr>
+              <w:t>2.600.059</w:t>
             </w:r>
           </w:p>
         </w:tc>
@@ -2851,6 +3105,7 @@
                 <w:sz w:val="22"/>
                 <w:szCs w:val="22"/>
               </w:rPr>
+              <w:lastRenderedPageBreak/>
               <w:t>Correct sample collection/technique?</w:t>
             </w:r>
           </w:p>
@@ -3076,7 +3331,31 @@
                 <w:sz w:val="22"/>
                 <w:szCs w:val="22"/>
               </w:rPr>
-              <w:t>Yes, as per SOP 2.600.023, 2.700.004</w:t>
+              <w:t>Yes, as per SOP</w:t>
+            </w:r>
+            <w:r>
+              <w:rPr>
+                <w:rFonts w:ascii="Times New Roman" w:hAnsi="Times New Roman"/>
+                <w:sz w:val="22"/>
+                <w:szCs w:val="22"/>
+              </w:rPr>
+              <w:t>#</w:t>
+            </w:r>
+            <w:r>
+              <w:rPr>
+                <w:rFonts w:ascii="Times New Roman" w:hAnsi="Times New Roman"/>
+                <w:sz w:val="22"/>
+                <w:szCs w:val="22"/>
+              </w:rPr>
+              <w:t xml:space="preserve"> </w:t>
+            </w:r>
+            <w:r>
+              <w:rPr>
+                <w:rFonts w:ascii="Times New Roman" w:hAnsi="Times New Roman"/>
+                <w:sz w:val="22"/>
+                <w:szCs w:val="22"/>
+              </w:rPr>
+              <w:t>2.600.059</w:t>
             </w:r>
           </w:p>
         </w:tc>
@@ -3330,7 +3609,32 @@
                 <w:sz w:val="22"/>
                 <w:szCs w:val="22"/>
               </w:rPr>
-              <w:t>{{ smart_comment_records }}</w:t>
+              <w:t xml:space="preserve">Yes, </w:t>
+            </w:r>
+            <w:r>
+              <w:rPr>
+                <w:rFonts w:ascii="Times New Roman" w:hAnsi="Times New Roman"/>
+                <w:sz w:val="22"/>
+                <w:szCs w:val="22"/>
+              </w:rPr>
+              <w:t>Information is available in EagleTrax under</w:t>
+            </w:r>
+            <w:r>
+              <w:rPr>
+                <w:rFonts w:ascii="Times New Roman" w:hAnsi="Times New Roman"/>
+                <w:sz w:val="22"/>
+                <w:szCs w:val="22"/>
+              </w:rPr>
+              <w:t xml:space="preserve"> </w:t>
+            </w:r>
+            <w:r>
+              <w:rPr>
+                <w:rFonts w:ascii="Times New Roman" w:hAnsi="Times New Roman"/>
+                <w:bCs/>
+                <w:sz w:val="22"/>
+                <w:szCs w:val="22"/>
+              </w:rPr>
+              <w:t xml:space="preserve"/>
             </w:r>
           </w:p>
         </w:tc>
@@ -3595,7 +3899,6 @@
                 <w:szCs w:val="22"/>
               </w:rPr>
             </w:pPr>
-            <w:bookmarkStart w:id="5" w:name="OLE_LINK14"/>
             <w:r>
               <w:rPr>
                 <w:rFonts w:ascii="Times New Roman" w:hAnsi="Times New Roman"/>
@@ -3606,21 +3909,21 @@
             </w:r>
             <w:r>
               <w:rPr>
-                <w:rFonts w:ascii="Times New Roman" w:hAnsi="Times New Roman"/>
-                <w:sz w:val="22"/>
-                <w:szCs w:val="22"/>
-              </w:rPr>
-              <w:t>all</w:t>
-            </w:r>
-            <w:r>
-              <w:rPr>
-                <w:rFonts w:ascii="Times New Roman" w:hAnsi="Times New Roman"/>
-                <w:sz w:val="22"/>
-                <w:szCs w:val="22"/>
-              </w:rPr>
-              <w:t xml:space="preserve"> analysts are trained and qualified by quality to perform the test.</w:t>
-            </w:r>
-            <w:bookmarkEnd w:id="5"/>
+                <w:rFonts w:ascii="Times New Roman" w:eastAsiaTheme="minorEastAsia" w:hAnsi="Times New Roman" w:hint="eastAsia"/>
+                <w:sz w:val="22"/>
+                <w:szCs w:val="22"/>
+                <w:lang w:eastAsia="zh-CN"/>
+              </w:rPr>
+              <w:t xml:space="preserve">all analysts </w:t>
+            </w:r>
+            <w:r>
+              <w:rPr>
+                <w:rFonts w:ascii="Times New Roman" w:hAnsi="Times New Roman"/>
+                <w:sz w:val="22"/>
+                <w:szCs w:val="22"/>
+              </w:rPr>
+              <w:t>are trained and qualified by quality to perform the test.</w:t>
+            </w:r>
           </w:p>
         </w:tc>
       </w:tr>
@@ -4383,7 +4686,50 @@
                 <w:sz w:val="22"/>
                 <w:szCs w:val="22"/>
               </w:rPr>
-              <w:t>{{ smart_comment_storage }}</w:t>
+              <w:t xml:space="preserve">Yes, </w:t>
+            </w:r>
+            <w:r>
+              <w:rPr>
+                <w:rFonts w:ascii="Times New Roman" w:hAnsi="Times New Roman"/>
+                <w:sz w:val="22"/>
+                <w:szCs w:val="22"/>
+              </w:rPr>
+              <w:t>the sample was stored as per client's instructions</w:t>
+            </w:r>
+            <w:r>
+              <w:rPr>
+                <w:rFonts w:ascii="Times New Roman" w:hAnsi="Times New Roman"/>
+                <w:sz w:val="22"/>
+                <w:szCs w:val="22"/>
+              </w:rPr>
+              <w:t xml:space="preserve">. </w:t>
+            </w:r>
+            <w:bookmarkStart w:id="7" w:name="OLE_LINK2"/>
+            <w:r>
+              <w:rPr>
+                <w:rFonts w:ascii="Times New Roman" w:hAnsi="Times New Roman"/>
+                <w:sz w:val="22"/>
+                <w:szCs w:val="22"/>
+              </w:rPr>
+              <w:t>Information is available in EagleTrax Sample</w:t>
+            </w:r>
+            <w:bookmarkEnd w:id="7"/>
+            <w:r>
+              <w:rPr>
+                <w:rFonts w:ascii="Times New Roman" w:hAnsi="Times New Roman"/>
+                <w:sz w:val="22"/>
+                <w:szCs w:val="22"/>
+              </w:rPr>
+              <w:t xml:space="preserve"> Location History under </w:t>
+            </w:r>
+            <w:r>
+              <w:rPr>
+                <w:rFonts w:ascii="Times New Roman" w:hAnsi="Times New Roman"/>
+                <w:bCs/>
+                <w:sz w:val="22"/>
+                <w:szCs w:val="22"/>
+              </w:rPr>
+              <w:t xml:space="preserve"/>
             </w:r>
           </w:p>
         </w:tc>
@@ -5015,7 +5361,6 @@
                 <w:sz w:val="22"/>
                 <w:szCs w:val="22"/>
               </w:rPr>
-              <w:lastRenderedPageBreak/>
               <w:t>Appropriate /correct glassware used?</w:t>
             </w:r>
           </w:p>
@@ -5507,6 +5852,7 @@
                 <w:szCs w:val="22"/>
               </w:rPr>
             </w:pPr>
+            <w:bookmarkStart w:id="8" w:name="OLE_LINK3"/>
             <w:r>
               <w:rPr>
                 <w:rFonts w:ascii="Times New Roman" w:hAnsi="Times New Roman"/>
@@ -5515,46 +5861,9 @@
                 <w:sz w:val="22"/>
                 <w:szCs w:val="22"/>
               </w:rPr>
-              <w:t>Scan Consumables:</w:t>
-            </w:r>
-          </w:p>
-          <w:p>
-            <w:pPr>
-              <w:outlineLvl w:val="0"/>
-              <w:rPr>
-                <w:rFonts w:ascii="Times New Roman" w:hAnsi="Times New Roman"/>
-                <w:sz w:val="22"/>
-                <w:szCs w:val="22"/>
-              </w:rPr>
-            </w:pPr>
-            <w:r>
-              <w:rPr>
-                <w:rFonts w:ascii="Times New Roman" w:hAnsi="Times New Roman"/>
-                <w:sz w:val="22"/>
-                <w:szCs w:val="22"/>
-              </w:rPr>
-              <w:t xml:space="preserve">See </w:t>
-            </w:r>
-            <w:r>
-              <w:rPr>
-                <w:rFonts w:ascii="Times New Roman" w:hAnsi="Times New Roman"/>
-                <w:sz w:val="22"/>
-                <w:szCs w:val="22"/>
-              </w:rPr>
-              <w:t xml:space="preserve">the </w:t>
-            </w:r>
-            <w:r>
-              <w:rPr>
-                <w:rFonts w:ascii="Times New Roman" w:hAnsi="Times New Roman"/>
-                <w:sz w:val="22"/>
-                <w:szCs w:val="22"/>
-              </w:rPr>
-              <w:t>attached data packet</w:t>
-            </w:r>
-          </w:p>
-          <w:p>
-            <w:pPr>
-              <w:outlineLvl w:val="0"/>
+              <w:t>Process</w:t>
+            </w:r>
+            <w:r>
               <w:rPr>
                 <w:rFonts w:ascii="Times New Roman" w:hAnsi="Times New Roman"/>
                 <w:b/>
@@ -5562,7 +5871,50 @@
                 <w:sz w:val="22"/>
                 <w:szCs w:val="22"/>
               </w:rPr>
-            </w:pPr>
+              <w:t xml:space="preserve"> Consumables:</w:t>
+            </w:r>
+          </w:p>
+          <w:p>
+            <w:pPr>
+              <w:outlineLvl w:val="0"/>
+              <w:rPr>
+                <w:rFonts w:ascii="Times New Roman" w:hAnsi="Times New Roman"/>
+                <w:sz w:val="22"/>
+                <w:szCs w:val="22"/>
+              </w:rPr>
+            </w:pPr>
+            <w:r>
+              <w:rPr>
+                <w:rFonts w:ascii="Times New Roman" w:hAnsi="Times New Roman"/>
+                <w:sz w:val="22"/>
+                <w:szCs w:val="22"/>
+              </w:rPr>
+              <w:t>Information is available in EagleTrax Sample</w:t>
+            </w:r>
+            <w:r>
+              <w:rPr>
+                <w:rFonts w:ascii="Times New Roman" w:hAnsi="Times New Roman"/>
+                <w:sz w:val="22"/>
+                <w:szCs w:val="22"/>
+              </w:rPr>
+              <w:t xml:space="preserve"> </w:t>
+            </w:r>
+            <w:r>
+              <w:rPr>
+                <w:rFonts w:ascii="Times New Roman" w:hAnsi="Times New Roman"/>
+                <w:sz w:val="22"/>
+                <w:szCs w:val="22"/>
+              </w:rPr>
+              <w:t>Consumables</w:t>
+            </w:r>
+            <w:r>
+              <w:rPr>
+                <w:rFonts w:ascii="Times New Roman" w:hAnsi="Times New Roman"/>
+                <w:sz w:val="22"/>
+                <w:szCs w:val="22"/>
+              </w:rPr>
+              <w:t xml:space="preserve"> section</w:t>
+            </w:r>
           </w:p>
           <w:p>
             <w:pPr>
@@ -5622,14 +5974,22 @@
               <w:rPr>
                 <w:rFonts w:ascii="Times New Roman" w:hAnsi="Times New Roman"/>
                 <w:b/>
-                <w:sz w:val="22"/>
-                <w:szCs w:val="22"/>
-              </w:rPr>
-            </w:pPr>
-          </w:p>
-          <w:p>
-            <w:pPr>
-              <w:outlineLvl w:val="0"/>
+                <w:bCs/>
+                <w:sz w:val="22"/>
+                <w:szCs w:val="22"/>
+              </w:rPr>
+            </w:pPr>
+          </w:p>
+          <w:p>
+            <w:pPr>
+              <w:outlineLvl w:val="0"/>
+              <w:rPr>
+                <w:rFonts w:ascii="Times New Roman" w:hAnsi="Times New Roman"/>
+                <w:sz w:val="22"/>
+                <w:szCs w:val="22"/>
+              </w:rPr>
+            </w:pPr>
+            <w:r>
               <w:rPr>
                 <w:rFonts w:ascii="Times New Roman" w:hAnsi="Times New Roman"/>
                 <w:b/>
@@ -5637,13 +5997,15 @@
                 <w:sz w:val="22"/>
                 <w:szCs w:val="22"/>
               </w:rPr>
-            </w:pPr>
-          </w:p>
-          <w:p>
-            <w:pPr>
-              <w:outlineLvl w:val="0"/>
-              <w:rPr>
-                <w:rFonts w:ascii="Times New Roman" w:hAnsi="Times New Roman"/>
+              <w:t>Monthly Cleaning:</w:t>
+            </w:r>
+          </w:p>
+          <w:p>
+            <w:pPr>
+              <w:outlineLvl w:val="0"/>
+              <w:rPr>
+                <w:rFonts w:ascii="Times New Roman" w:hAnsi="Times New Roman"/>
+                <w:bCs/>
                 <w:sz w:val="22"/>
                 <w:szCs w:val="22"/>
               </w:rPr>
@@ -5652,62 +6014,51 @@
               <w:rPr>
                 <w:rFonts w:ascii="Times New Roman" w:hAnsi="Times New Roman"/>
                 <w:b/>
-                <w:bCs/>
-                <w:sz w:val="22"/>
-                <w:szCs w:val="22"/>
-              </w:rPr>
-              <w:t>Monthly Cleaning:</w:t>
-            </w:r>
-          </w:p>
-          <w:p>
-            <w:pPr>
-              <w:outlineLvl w:val="0"/>
-              <w:rPr>
-                <w:rFonts w:ascii="Times New Roman" w:hAnsi="Times New Roman"/>
-                <w:bCs/>
-                <w:sz w:val="22"/>
-                <w:szCs w:val="22"/>
-              </w:rPr>
-            </w:pPr>
-            <w:r>
+                <w:sz w:val="22"/>
+                <w:szCs w:val="22"/>
+              </w:rPr>
+              <w:t>H2O2 strips and IPA:</w:t>
+            </w:r>
+            <w:r>
+              <w:rPr>
+                <w:rFonts w:ascii="Times New Roman" w:hAnsi="Times New Roman"/>
+                <w:bCs/>
+                <w:sz w:val="22"/>
+                <w:szCs w:val="22"/>
+              </w:rPr>
+              <w:t xml:space="preserve"> See attached monthly cleaning logs</w:t>
+            </w:r>
+          </w:p>
+          <w:bookmarkEnd w:id="8"/>
+          <w:p>
+            <w:pPr>
+              <w:outlineLvl w:val="0"/>
+              <w:rPr>
+                <w:rFonts w:ascii="Times New Roman" w:hAnsi="Times New Roman"/>
+                <w:bCs/>
+                <w:sz w:val="22"/>
+                <w:szCs w:val="22"/>
+                <w:highlight w:val="yellow"/>
+              </w:rPr>
+            </w:pPr>
+          </w:p>
+        </w:tc>
+        <w:tc>
+          <w:tcPr>
+            <w:tcW w:w="1800" w:type="dxa"/>
+          </w:tcPr>
+          <w:p>
+            <w:pPr>
+              <w:outlineLvl w:val="0"/>
               <w:rPr>
                 <w:rFonts w:ascii="Times New Roman" w:hAnsi="Times New Roman"/>
                 <w:b/>
-                <w:sz w:val="22"/>
-                <w:szCs w:val="22"/>
-              </w:rPr>
-              <w:t>H2O2 strips and IPA:</w:t>
-            </w:r>
-            <w:r>
-              <w:rPr>
-                <w:rFonts w:ascii="Times New Roman" w:hAnsi="Times New Roman"/>
-                <w:bCs/>
-                <w:sz w:val="22"/>
-                <w:szCs w:val="22"/>
-              </w:rPr>
-              <w:t xml:space="preserve"> See attached monthly cleaning logs</w:t>
-            </w:r>
-          </w:p>
-          <w:p>
-            <w:pPr>
-              <w:outlineLvl w:val="0"/>
-              <w:rPr>
-                <w:rFonts w:ascii="Times New Roman" w:hAnsi="Times New Roman"/>
-                <w:bCs/>
-                <w:sz w:val="22"/>
-                <w:szCs w:val="22"/>
-                <w:highlight w:val="yellow"/>
-              </w:rPr>
-            </w:pPr>
-          </w:p>
-        </w:tc>
-        <w:tc>
-          <w:tcPr>
-            <w:tcW w:w="1800" w:type="dxa"/>
-          </w:tcPr>
-          <w:p>
-            <w:pPr>
-              <w:outlineLvl w:val="0"/>
+                <w:bCs/>
+                <w:sz w:val="22"/>
+                <w:szCs w:val="22"/>
+              </w:rPr>
+            </w:pPr>
+            <w:r>
               <w:rPr>
                 <w:rFonts w:ascii="Times New Roman" w:hAnsi="Times New Roman"/>
                 <w:b/>
@@ -5715,7 +6066,8 @@
                 <w:sz w:val="22"/>
                 <w:szCs w:val="22"/>
               </w:rPr>
-            </w:pPr>
+              <w:t>Process</w:t>
+            </w:r>
             <w:r>
               <w:rPr>
                 <w:rFonts w:ascii="Times New Roman" w:hAnsi="Times New Roman"/>
@@ -5724,36 +6076,50 @@
                 <w:sz w:val="22"/>
                 <w:szCs w:val="22"/>
               </w:rPr>
-              <w:t>Scan Consumables:</w:t>
-            </w:r>
-          </w:p>
-          <w:p>
-            <w:pPr>
-              <w:outlineLvl w:val="0"/>
-              <w:rPr>
-                <w:rFonts w:ascii="Times New Roman" w:hAnsi="Times New Roman"/>
-                <w:sz w:val="22"/>
-                <w:szCs w:val="22"/>
-              </w:rPr>
-            </w:pPr>
-            <w:r>
-              <w:rPr>
-                <w:rFonts w:ascii="Times New Roman" w:hAnsi="Times New Roman"/>
-                <w:sz w:val="22"/>
-                <w:szCs w:val="22"/>
-              </w:rPr>
-              <w:t>See attached data packet</w:t>
-            </w:r>
-          </w:p>
-          <w:p>
-            <w:pPr>
-              <w:outlineLvl w:val="0"/>
-              <w:rPr>
-                <w:rFonts w:ascii="Times New Roman" w:hAnsi="Times New Roman"/>
-                <w:sz w:val="22"/>
-                <w:szCs w:val="22"/>
-              </w:rPr>
-            </w:pPr>
+              <w:t xml:space="preserve"> Consumables:</w:t>
+            </w:r>
+          </w:p>
+          <w:p>
+            <w:pPr>
+              <w:outlineLvl w:val="0"/>
+              <w:rPr>
+                <w:rFonts w:ascii="Times New Roman" w:hAnsi="Times New Roman"/>
+                <w:sz w:val="22"/>
+                <w:szCs w:val="22"/>
+              </w:rPr>
+            </w:pPr>
+            <w:r>
+              <w:rPr>
+                <w:rFonts w:ascii="Times New Roman" w:hAnsi="Times New Roman"/>
+                <w:sz w:val="22"/>
+                <w:szCs w:val="22"/>
+              </w:rPr>
+              <w:t>Information is available in EagleTrax Sample</w:t>
+            </w:r>
+            <w:r>
+              <w:rPr>
+                <w:rFonts w:ascii="Times New Roman" w:hAnsi="Times New Roman"/>
+                <w:sz w:val="22"/>
+                <w:szCs w:val="22"/>
+              </w:rPr>
+              <w:t xml:space="preserve"> </w:t>
+            </w:r>
+            <w:r>
+              <w:rPr>
+                <w:rFonts w:ascii="Times New Roman" w:hAnsi="Times New Roman"/>
+                <w:sz w:val="22"/>
+                <w:szCs w:val="22"/>
+              </w:rPr>
+              <w:t>Consumables</w:t>
+            </w:r>
+            <w:r>
+              <w:rPr>
+                <w:rFonts w:ascii="Times New Roman" w:hAnsi="Times New Roman"/>
+                <w:sz w:val="22"/>
+                <w:szCs w:val="22"/>
+              </w:rPr>
+              <w:t xml:space="preserve"> section</w:t>
+            </w:r>
           </w:p>
           <w:p>
             <w:pPr>
@@ -5766,7 +6132,10 @@
                 <w:szCs w:val="22"/>
               </w:rPr>
             </w:pPr>
-            <w:r>
+          </w:p>
+          <w:p>
+            <w:pPr>
+              <w:outlineLvl w:val="0"/>
               <w:rPr>
                 <w:rFonts w:ascii="Times New Roman" w:hAnsi="Times New Roman"/>
                 <w:b/>
@@ -5774,6 +6143,15 @@
                 <w:sz w:val="22"/>
                 <w:szCs w:val="22"/>
               </w:rPr>
+            </w:pPr>
+            <w:r>
+              <w:rPr>
+                <w:rFonts w:ascii="Times New Roman" w:hAnsi="Times New Roman"/>
+                <w:b/>
+                <w:bCs/>
+                <w:sz w:val="22"/>
+                <w:szCs w:val="22"/>
+              </w:rPr>
               <w:t>Environmental Plates:</w:t>
             </w:r>
           </w:p>
@@ -5800,6 +6178,8 @@
               <w:outlineLvl w:val="0"/>
               <w:rPr>
                 <w:rFonts w:ascii="Times New Roman" w:hAnsi="Times New Roman"/>
+                <w:b/>
+                <w:bCs/>
                 <w:sz w:val="22"/>
                 <w:szCs w:val="22"/>
               </w:rPr>
@@ -5916,12 +6296,6 @@
               </w:rPr>
             </w:pPr>
             <w:r>
-              <w:rPr>
-                <w:rFonts w:ascii="Times New Roman" w:eastAsiaTheme="minorEastAsia" w:hAnsi="Times New Roman"/>
-                <w:sz w:val="22"/>
-                <w:szCs w:val="22"/>
-                <w:lang w:eastAsia="zh-CN"/>
-              </w:rPr>
               <w:t xml:space="preserve">  </w:t>
             </w:r>
             <w:r>
@@ -5953,9 +6327,10 @@
             </w:pPr>
             <w:r>
               <w:rPr>
-                <w:rFonts w:ascii="Times New Roman" w:hAnsi="Times New Roman"/>
-                <w:sz w:val="22"/>
-                <w:szCs w:val="22"/>
+                <w:rFonts w:ascii="Times New Roman" w:eastAsiaTheme="minorEastAsia" w:hAnsi="Times New Roman"/>
+                <w:sz w:val="22"/>
+                <w:szCs w:val="22"/>
+                <w:lang w:eastAsia="zh-CN"/>
               </w:rPr>
               <w:t>Not Applicable</w:t>
             </w:r>
@@ -6012,6 +6387,7 @@
                 <w:sz w:val="22"/>
                 <w:szCs w:val="22"/>
               </w:rPr>
+              <w:lastRenderedPageBreak/>
               <w:t xml:space="preserve">Solvent Used </w:t>
             </w:r>
           </w:p>
@@ -6032,6 +6408,7 @@
                 <w:szCs w:val="22"/>
               </w:rPr>
             </w:pPr>
+            <w:bookmarkStart w:id="9" w:name="OLE_LINK4"/>
             <w:r>
               <w:rPr>
                 <w:rFonts w:ascii="Times New Roman" w:hAnsi="Times New Roman"/>
@@ -6040,6 +6417,7 @@
               </w:rPr>
               <w:t>Not Applicable</w:t>
             </w:r>
+            <w:bookmarkEnd w:id="9"/>
           </w:p>
         </w:tc>
         <w:tc>
@@ -7069,24 +7447,17 @@
                 <w:sz w:val="22"/>
                 <w:szCs w:val="22"/>
               </w:rPr>
-              <w:t>{{smart_</w:t>
-            </w:r>
-            <w:r>
-              <w:rPr>
-                <w:rFonts w:ascii="Times New Roman" w:eastAsiaTheme="minorEastAsia" w:hAnsi="Times New Roman" w:hint="eastAsia"/>
+              <w:t>ISO 5 BSC E00</w:t>
+            </w:r>
+            <w:r>
+              <w:rPr>
+                <w:rFonts w:ascii="Times New Roman" w:eastAsiaTheme="minorEastAsia" w:hAnsi="Times New Roman"/>
+                <w:bCs/>
                 <w:sz w:val="22"/>
                 <w:szCs w:val="22"/>
                 <w:lang w:eastAsia="zh-CN"/>
               </w:rPr>
-              <w:t>bsc</w:t>
-            </w:r>
-            <w:r>
-              <w:rPr>
-                <w:rFonts w:ascii="Times New Roman" w:hAnsi="Times New Roman"/>
-                <w:sz w:val="22"/>
-                <w:szCs w:val="22"/>
-              </w:rPr>
-              <w:t>_id}}</w:t>
+              <w:t xml:space="preserve"/>
             </w:r>
           </w:p>
         </w:tc>
@@ -7106,14 +7477,25 @@
                 <w:szCs w:val="22"/>
               </w:rPr>
             </w:pPr>
-            <w:r>
-              <w:rPr>
-                <w:rFonts w:ascii="Times New Roman" w:hAnsi="Times New Roman"/>
-                <w:sz w:val="22"/>
-                <w:szCs w:val="22"/>
-              </w:rPr>
-              <w:t>Oct26</w:t>
-            </w:r>
+            <w:bookmarkStart w:id="10" w:name="OLE_LINK10"/>
+            <w:r>
+              <w:rPr>
+                <w:rFonts w:ascii="Times New Roman" w:eastAsiaTheme="minorEastAsia" w:hAnsi="Times New Roman" w:hint="eastAsia"/>
+                <w:sz w:val="22"/>
+                <w:szCs w:val="22"/>
+                <w:lang w:eastAsia="zh-CN"/>
+              </w:rPr>
+              <w:t>Mar 20</w:t>
+            </w:r>
+            <w:r>
+              <w:rPr>
+                <w:rFonts w:ascii="Times New Roman" w:hAnsi="Times New Roman"/>
+                <w:sz w:val="22"/>
+                <w:szCs w:val="22"/>
+              </w:rPr>
+              <w:t>26</w:t>
+            </w:r>
+            <w:bookmarkEnd w:id="10"/>
           </w:p>
         </w:tc>
       </w:tr>
@@ -7355,38 +7737,76 @@
               <w:jc w:val="center"/>
               <w:outlineLvl w:val="0"/>
               <w:rPr>
-                <w:rFonts w:ascii="Times New Roman" w:eastAsiaTheme="minorEastAsia" w:hAnsi="Times New Roman"/>
-                <w:sz w:val="22"/>
-                <w:szCs w:val="22"/>
-                <w:highlight w:val="yellow"/>
-                <w:lang w:eastAsia="zh-CN"/>
-              </w:rPr>
-            </w:pPr>
-            <w:r>
-              <w:rPr>
-                <w:rFonts w:ascii="Times New Roman" w:hAnsi="Times New Roman"/>
-                <w:sz w:val="22"/>
-                <w:szCs w:val="22"/>
-              </w:rPr>
-              <w:t>{{smart_</w:t>
-            </w:r>
-            <w:r>
-              <w:rPr>
-                <w:rFonts w:ascii="Times New Roman" w:eastAsiaTheme="minorEastAsia" w:hAnsi="Times New Roman" w:hint="eastAsia"/>
-                <w:sz w:val="22"/>
-                <w:szCs w:val="22"/>
-                <w:lang w:eastAsia="zh-CN"/>
-              </w:rPr>
-              <w:t>cr</w:t>
-            </w:r>
-            <w:r>
-              <w:rPr>
-                <w:rFonts w:ascii="Times New Roman" w:hAnsi="Times New Roman"/>
-                <w:sz w:val="22"/>
-                <w:szCs w:val="22"/>
-              </w:rPr>
-              <w:t>_id}}</w:t>
-            </w:r>
+                <w:rFonts w:ascii="Times New Roman" w:hAnsi="Times New Roman"/>
+                <w:sz w:val="22"/>
+                <w:szCs w:val="22"/>
+              </w:rPr>
+            </w:pPr>
+            <w:r>
+              <w:rPr>
+                <w:rFonts w:ascii="Times New Roman" w:hAnsi="Times New Roman"/>
+                <w:sz w:val="22"/>
+                <w:szCs w:val="22"/>
+              </w:rPr>
+              <w:t>E00</w:t>
+            </w:r>
+            <w:bookmarkStart w:id="11" w:name="OLE_LINK6"/>
+            <w:r>
+              <w:rPr>
+                <w:rFonts w:ascii="Times New Roman" w:hAnsi="Times New Roman"/>
+                <w:sz w:val="22"/>
+                <w:szCs w:val="22"/>
+              </w:rPr>
+              <w:t xml:space="preserve"/>
+            </w:r>
+            <w:bookmarkEnd w:id="11"/>
+            <w:r>
+              <w:rPr>
+                <w:rFonts w:ascii="Times New Roman" w:hAnsi="Times New Roman"/>
+                <w:sz w:val="22"/>
+                <w:szCs w:val="22"/>
+              </w:rPr>
+              <w:t xml:space="preserve"> </w:t>
+            </w:r>
+            <w:bookmarkStart w:id="12" w:name="OLE_LINK7"/>
+            <w:r>
+              <w:rPr>
+                <w:rFonts w:ascii="Times New Roman" w:hAnsi="Times New Roman"/>
+                <w:sz w:val="22"/>
+                <w:szCs w:val="22"/>
+              </w:rPr>
+              <w:t>(CR</w:t>
+            </w:r>
+            <w:bookmarkStart w:id="13" w:name="OLE_LINK14"/>
+            <w:r>
+              <w:rPr>
+                <w:rFonts w:ascii="Times New Roman" w:hAnsi="Times New Roman"/>
+                <w:sz w:val="22"/>
+                <w:szCs w:val="22"/>
+              </w:rPr>
+              <w:t xml:space="preserve"/>
+            </w:r>
+            <w:bookmarkEnd w:id="13"/>
+            <w:r>
+              <w:rPr>
+                <w:rFonts w:ascii="Times New Roman" w:hAnsi="Times New Roman"/>
+                <w:sz w:val="22"/>
+                <w:szCs w:val="22"/>
+              </w:rPr>
+              <w:t>)</w:t>
+            </w:r>
+            <w:bookmarkEnd w:id="12"/>
+          </w:p>
+          <w:p>
+            <w:pPr>
+              <w:jc w:val="center"/>
+              <w:outlineLvl w:val="0"/>
+              <w:rPr>
+                <w:rFonts w:ascii="Times New Roman" w:hAnsi="Times New Roman"/>
+                <w:sz w:val="22"/>
+                <w:szCs w:val="22"/>
+              </w:rPr>
+            </w:pPr>
           </w:p>
         </w:tc>
         <w:tc>
@@ -7399,26 +7819,70 @@
               <w:jc w:val="center"/>
               <w:outlineLvl w:val="0"/>
               <w:rPr>
-                <w:rFonts w:ascii="Times New Roman" w:hAnsi="Times New Roman"/>
-                <w:sz w:val="22"/>
-                <w:szCs w:val="22"/>
-              </w:rPr>
-            </w:pPr>
-            <w:r>
-              <w:rPr>
-                <w:rFonts w:ascii="Times New Roman" w:hAnsi="Times New Roman"/>
-                <w:sz w:val="22"/>
-                <w:szCs w:val="22"/>
-              </w:rPr>
-              <w:t>Dec2</w:t>
-            </w:r>
-            <w:r>
-              <w:rPr>
-                <w:rFonts w:ascii="Times New Roman" w:hAnsi="Times New Roman"/>
-                <w:sz w:val="22"/>
-                <w:szCs w:val="22"/>
-              </w:rPr>
-              <w:t>5</w:t>
+                <w:rFonts w:ascii="Times New Roman" w:eastAsiaTheme="minorEastAsia" w:hAnsi="Times New Roman"/>
+                <w:sz w:val="22"/>
+                <w:szCs w:val="22"/>
+                <w:lang w:eastAsia="zh-CN"/>
+              </w:rPr>
+            </w:pPr>
+            <w:r>
+              <w:rPr>
+                <w:rFonts w:ascii="Times New Roman" w:eastAsiaTheme="minorEastAsia" w:hAnsi="Times New Roman" w:hint="eastAsia"/>
+                <w:sz w:val="22"/>
+                <w:szCs w:val="22"/>
+                <w:lang w:eastAsia="zh-CN"/>
+              </w:rPr>
+              <w:t>Jun 20</w:t>
+            </w:r>
+            <w:r>
+              <w:rPr>
+                <w:rFonts w:ascii="Times New Roman" w:hAnsi="Times New Roman"/>
+                <w:sz w:val="22"/>
+                <w:szCs w:val="22"/>
+              </w:rPr>
+              <w:t>2</w:t>
+            </w:r>
+            <w:r>
+              <w:rPr>
+                <w:rFonts w:ascii="Times New Roman" w:eastAsiaTheme="minorEastAsia" w:hAnsi="Times New Roman" w:hint="eastAsia"/>
+                <w:sz w:val="22"/>
+                <w:szCs w:val="22"/>
+                <w:lang w:eastAsia="zh-CN"/>
+              </w:rPr>
+              <w:t>6</w:t>
+            </w:r>
+          </w:p>
+          <w:p>
+            <w:pPr>
+              <w:jc w:val="center"/>
+              <w:outlineLvl w:val="0"/>
+              <w:rPr>
+                <w:rFonts w:ascii="Times New Roman" w:eastAsiaTheme="minorEastAsia" w:hAnsi="Times New Roman"/>
+                <w:sz w:val="22"/>
+                <w:szCs w:val="22"/>
+                <w:lang w:eastAsia="zh-CN"/>
+              </w:rPr>
+            </w:pPr>
+          </w:p>
+          <w:p>
+            <w:pPr>
+              <w:jc w:val="center"/>
+              <w:outlineLvl w:val="0"/>
+              <w:rPr>
+                <w:rFonts w:ascii="Times New Roman" w:eastAsiaTheme="minorEastAsia" w:hAnsi="Times New Roman"/>
+                <w:sz w:val="22"/>
+                <w:szCs w:val="22"/>
+                <w:lang w:eastAsia="zh-CN"/>
+              </w:rPr>
+            </w:pPr>
+            <w:r>
+              <w:rPr>
+                <w:rFonts w:ascii="Times New Roman" w:eastAsiaTheme="minorEastAsia" w:hAnsi="Times New Roman" w:hint="eastAsia"/>
+                <w:sz w:val="22"/>
+                <w:szCs w:val="22"/>
+                <w:lang w:eastAsia="zh-CN"/>
+              </w:rPr>
+              <w:t>Dec 2026</w:t>
             </w:r>
           </w:p>
         </w:tc>
@@ -7694,11 +8158,20 @@
             </w:pPr>
             <w:r>
               <w:rPr>
-                <w:rFonts w:ascii="Times New Roman" w:hAnsi="Times New Roman"/>
-                <w:sz w:val="22"/>
-                <w:szCs w:val="22"/>
-              </w:rPr>
-              <w:t>Not Applicable</w:t>
+                <w:rFonts w:ascii="Times New Roman" w:eastAsiaTheme="minorEastAsia" w:hAnsi="Times New Roman" w:hint="eastAsia"/>
+                <w:sz w:val="22"/>
+                <w:szCs w:val="22"/>
+                <w:lang w:eastAsia="zh-CN"/>
+              </w:rPr>
+              <w:t>Mar 20</w:t>
+            </w:r>
+            <w:r>
+              <w:rPr>
+                <w:rFonts w:ascii="Times New Roman" w:hAnsi="Times New Roman"/>
+                <w:sz w:val="22"/>
+                <w:szCs w:val="22"/>
+              </w:rPr>
+              <w:t>26</w:t>
             </w:r>
           </w:p>
         </w:tc>
@@ -9088,6 +9561,7 @@
                 <w:szCs w:val="22"/>
               </w:rPr>
             </w:pPr>
+            <w:bookmarkStart w:id="14" w:name="OLE_LINK11"/>
             <w:r>
               <w:rPr>
                 <w:rFonts w:ascii="Times New Roman" w:hAnsi="Times New Roman"/>
@@ -9151,9 +9625,69 @@
                 <w:sz w:val="22"/>
                 <w:szCs w:val="22"/>
               </w:rPr>
-              <w:lastRenderedPageBreak/>
               <w:t>Incubator E001031 (Sensor E001505)</w:t>
             </w:r>
+          </w:p>
+          <w:p>
+            <w:pPr>
+              <w:jc w:val="center"/>
+              <w:outlineLvl w:val="0"/>
+              <w:rPr>
+                <w:rFonts w:ascii="Times New Roman" w:hAnsi="Times New Roman"/>
+                <w:sz w:val="22"/>
+                <w:szCs w:val="22"/>
+              </w:rPr>
+            </w:pPr>
+          </w:p>
+          <w:p>
+            <w:pPr>
+              <w:jc w:val="center"/>
+              <w:outlineLvl w:val="0"/>
+              <w:rPr>
+                <w:rFonts w:ascii="Times New Roman" w:hAnsi="Times New Roman"/>
+                <w:sz w:val="22"/>
+                <w:szCs w:val="22"/>
+              </w:rPr>
+            </w:pPr>
+            <w:r>
+              <w:rPr>
+                <w:rFonts w:ascii="Times New Roman" w:hAnsi="Times New Roman"/>
+                <w:sz w:val="22"/>
+                <w:szCs w:val="22"/>
+              </w:rPr>
+              <w:t>Incubator E001356 (Sensor E001450)</w:t>
+            </w:r>
+          </w:p>
+          <w:p>
+            <w:pPr>
+              <w:jc w:val="center"/>
+              <w:outlineLvl w:val="0"/>
+              <w:rPr>
+                <w:rFonts w:ascii="Times New Roman" w:hAnsi="Times New Roman"/>
+                <w:sz w:val="22"/>
+                <w:szCs w:val="22"/>
+              </w:rPr>
+            </w:pPr>
+          </w:p>
+          <w:p>
+            <w:pPr>
+              <w:jc w:val="center"/>
+              <w:outlineLvl w:val="0"/>
+              <w:rPr>
+                <w:rFonts w:ascii="Times New Roman" w:hAnsi="Times New Roman"/>
+                <w:sz w:val="22"/>
+                <w:szCs w:val="22"/>
+              </w:rPr>
+            </w:pPr>
+            <w:r>
+              <w:rPr>
+                <w:rFonts w:ascii="Times New Roman" w:hAnsi="Times New Roman"/>
+                <w:sz w:val="22"/>
+                <w:szCs w:val="22"/>
+              </w:rPr>
+              <w:t>Incubator E001357 (Sensor E001449)</w:t>
+            </w:r>
+            <w:bookmarkEnd w:id="14"/>
           </w:p>
         </w:tc>
         <w:tc>
@@ -9163,6 +9697,43 @@
           </w:tcPr>
           <w:p>
             <w:pPr>
+              <w:outlineLvl w:val="0"/>
+              <w:rPr>
+                <w:rFonts w:ascii="Times New Roman" w:hAnsi="Times New Roman"/>
+                <w:sz w:val="22"/>
+                <w:szCs w:val="22"/>
+              </w:rPr>
+            </w:pPr>
+            <w:r>
+              <w:rPr>
+                <w:rFonts w:ascii="Times New Roman" w:eastAsiaTheme="minorEastAsia" w:hAnsi="Times New Roman" w:hint="eastAsia"/>
+                <w:sz w:val="22"/>
+                <w:szCs w:val="22"/>
+                <w:lang w:eastAsia="zh-CN"/>
+              </w:rPr>
+              <w:t xml:space="preserve">       </w:t>
+            </w:r>
+            <w:bookmarkStart w:id="15" w:name="OLE_LINK12"/>
+            <w:r>
+              <w:rPr>
+                <w:rFonts w:ascii="Times New Roman" w:eastAsiaTheme="minorEastAsia" w:hAnsi="Times New Roman" w:hint="eastAsia"/>
+                <w:sz w:val="22"/>
+                <w:szCs w:val="22"/>
+                <w:lang w:eastAsia="zh-CN"/>
+              </w:rPr>
+              <w:t>Jun 20</w:t>
+            </w:r>
+            <w:r>
+              <w:rPr>
+                <w:rFonts w:ascii="Times New Roman" w:hAnsi="Times New Roman"/>
+                <w:sz w:val="22"/>
+                <w:szCs w:val="22"/>
+              </w:rPr>
+              <w:t>26</w:t>
+            </w:r>
+          </w:p>
+          <w:p>
+            <w:pPr>
               <w:jc w:val="center"/>
               <w:outlineLvl w:val="0"/>
               <w:rPr>
@@ -9177,8 +9748,41 @@
                 <w:sz w:val="22"/>
                 <w:szCs w:val="22"/>
               </w:rPr>
-              <w:lastRenderedPageBreak/>
-              <w:t>Aug26</w:t>
+              <w:t>Feb</w:t>
+            </w:r>
+            <w:r>
+              <w:rPr>
+                <w:rFonts w:ascii="Times New Roman" w:eastAsiaTheme="minorEastAsia" w:hAnsi="Times New Roman" w:hint="eastAsia"/>
+                <w:sz w:val="22"/>
+                <w:szCs w:val="22"/>
+                <w:lang w:eastAsia="zh-CN"/>
+              </w:rPr>
+              <w:t xml:space="preserve"> 20</w:t>
+            </w:r>
+            <w:r>
+              <w:rPr>
+                <w:rFonts w:ascii="Times New Roman" w:hAnsi="Times New Roman"/>
+                <w:sz w:val="22"/>
+                <w:szCs w:val="22"/>
+              </w:rPr>
+              <w:t>2</w:t>
+            </w:r>
+            <w:r>
+              <w:rPr>
+                <w:rFonts w:ascii="Times New Roman" w:eastAsiaTheme="minorEastAsia" w:hAnsi="Times New Roman" w:hint="eastAsia"/>
+                <w:sz w:val="22"/>
+                <w:szCs w:val="22"/>
+                <w:lang w:eastAsia="zh-CN"/>
+              </w:rPr>
+              <w:t>7</w:t>
+            </w:r>
+            <w:r>
+              <w:rPr>
+                <w:rFonts w:ascii="Times New Roman" w:hAnsi="Times New Roman"/>
+                <w:sz w:val="22"/>
+                <w:szCs w:val="22"/>
+              </w:rPr>
+              <w:t xml:space="preserve"> </w:t>
             </w:r>
           </w:p>
           <w:p>
@@ -9197,7 +9801,7 @@
                 <w:sz w:val="22"/>
                 <w:szCs w:val="22"/>
               </w:rPr>
-              <w:t xml:space="preserve">Feb26 </w:t>
+              <w:t xml:space="preserve"> </w:t>
             </w:r>
           </w:p>
           <w:p>
@@ -9212,11 +9816,20 @@
             </w:pPr>
             <w:r>
               <w:rPr>
-                <w:rFonts w:ascii="Times New Roman" w:hAnsi="Times New Roman"/>
-                <w:sz w:val="22"/>
-                <w:szCs w:val="22"/>
-              </w:rPr>
-              <w:t xml:space="preserve"> </w:t>
+                <w:rFonts w:ascii="Times New Roman" w:eastAsiaTheme="minorEastAsia" w:hAnsi="Times New Roman" w:hint="eastAsia"/>
+                <w:sz w:val="22"/>
+                <w:szCs w:val="22"/>
+                <w:lang w:eastAsia="zh-CN"/>
+              </w:rPr>
+              <w:t>Jun 20</w:t>
+            </w:r>
+            <w:r>
+              <w:rPr>
+                <w:rFonts w:ascii="Times New Roman" w:hAnsi="Times New Roman"/>
+                <w:sz w:val="22"/>
+                <w:szCs w:val="22"/>
+              </w:rPr>
+              <w:t>26</w:t>
             </w:r>
           </w:p>
           <w:p>
@@ -9224,19 +9837,45 @@
               <w:jc w:val="center"/>
               <w:outlineLvl w:val="0"/>
               <w:rPr>
-                <w:rFonts w:ascii="Times New Roman" w:hAnsi="Times New Roman"/>
-                <w:sz w:val="22"/>
-                <w:szCs w:val="22"/>
-              </w:rPr>
-            </w:pPr>
-            <w:r>
-              <w:rPr>
-                <w:rFonts w:ascii="Times New Roman" w:hAnsi="Times New Roman"/>
-                <w:sz w:val="22"/>
-                <w:szCs w:val="22"/>
-              </w:rPr>
-              <w:lastRenderedPageBreak/>
-              <w:t>Aug26</w:t>
+                <w:rFonts w:ascii="Times New Roman" w:eastAsiaTheme="minorEastAsia" w:hAnsi="Times New Roman"/>
+                <w:sz w:val="22"/>
+                <w:szCs w:val="22"/>
+                <w:lang w:eastAsia="zh-CN"/>
+              </w:rPr>
+            </w:pPr>
+            <w:r>
+              <w:rPr>
+                <w:rFonts w:ascii="Times New Roman" w:hAnsi="Times New Roman"/>
+                <w:sz w:val="22"/>
+                <w:szCs w:val="22"/>
+              </w:rPr>
+              <w:t>Feb</w:t>
+            </w:r>
+            <w:r>
+              <w:rPr>
+                <w:rFonts w:ascii="Times New Roman" w:eastAsiaTheme="minorEastAsia" w:hAnsi="Times New Roman" w:hint="eastAsia"/>
+                <w:sz w:val="22"/>
+                <w:szCs w:val="22"/>
+                <w:lang w:eastAsia="zh-CN"/>
+              </w:rPr>
+              <w:t xml:space="preserve"> 20</w:t>
+            </w:r>
+            <w:r>
+              <w:rPr>
+                <w:rFonts w:ascii="Times New Roman" w:hAnsi="Times New Roman"/>
+                <w:sz w:val="22"/>
+                <w:szCs w:val="22"/>
+              </w:rPr>
+              <w:t>2</w:t>
+            </w:r>
+            <w:r>
+              <w:rPr>
+                <w:rFonts w:ascii="Times New Roman" w:eastAsiaTheme="minorEastAsia" w:hAnsi="Times New Roman" w:hint="eastAsia"/>
+                <w:sz w:val="22"/>
+                <w:szCs w:val="22"/>
+                <w:lang w:eastAsia="zh-CN"/>
+              </w:rPr>
+              <w:t>7</w:t>
             </w:r>
           </w:p>
           <w:p>
@@ -9244,19 +9883,87 @@
               <w:jc w:val="center"/>
               <w:outlineLvl w:val="0"/>
               <w:rPr>
-                <w:rFonts w:ascii="Times New Roman" w:hAnsi="Times New Roman"/>
-                <w:sz w:val="22"/>
-                <w:szCs w:val="22"/>
-              </w:rPr>
-            </w:pPr>
-            <w:r>
-              <w:rPr>
-                <w:rFonts w:ascii="Times New Roman" w:hAnsi="Times New Roman"/>
-                <w:sz w:val="22"/>
-                <w:szCs w:val="22"/>
-              </w:rPr>
-              <w:t>Feb26</w:t>
-            </w:r>
+                <w:rFonts w:ascii="Times New Roman" w:eastAsiaTheme="minorEastAsia" w:hAnsi="Times New Roman"/>
+                <w:sz w:val="22"/>
+                <w:szCs w:val="22"/>
+                <w:lang w:eastAsia="zh-CN"/>
+              </w:rPr>
+            </w:pPr>
+          </w:p>
+          <w:p>
+            <w:pPr>
+              <w:jc w:val="center"/>
+              <w:outlineLvl w:val="0"/>
+              <w:rPr>
+                <w:rFonts w:ascii="Times New Roman" w:hAnsi="Times New Roman"/>
+                <w:sz w:val="22"/>
+                <w:szCs w:val="22"/>
+              </w:rPr>
+            </w:pPr>
+            <w:r>
+              <w:rPr>
+                <w:rFonts w:ascii="Times New Roman" w:eastAsiaTheme="minorEastAsia" w:hAnsi="Times New Roman" w:hint="eastAsia"/>
+                <w:sz w:val="22"/>
+                <w:szCs w:val="22"/>
+                <w:lang w:eastAsia="zh-CN"/>
+              </w:rPr>
+              <w:t>Jun 20</w:t>
+            </w:r>
+            <w:r>
+              <w:rPr>
+                <w:rFonts w:ascii="Times New Roman" w:hAnsi="Times New Roman"/>
+                <w:sz w:val="22"/>
+                <w:szCs w:val="22"/>
+              </w:rPr>
+              <w:t>26</w:t>
+            </w:r>
+          </w:p>
+          <w:p>
+            <w:pPr>
+              <w:jc w:val="center"/>
+              <w:outlineLvl w:val="0"/>
+              <w:rPr>
+                <w:rFonts w:ascii="Times New Roman" w:eastAsiaTheme="minorEastAsia" w:hAnsi="Times New Roman"/>
+                <w:sz w:val="22"/>
+                <w:szCs w:val="22"/>
+                <w:lang w:eastAsia="zh-CN"/>
+              </w:rPr>
+            </w:pPr>
+            <w:r>
+              <w:rPr>
+                <w:rFonts w:ascii="Times New Roman" w:hAnsi="Times New Roman"/>
+                <w:sz w:val="22"/>
+                <w:szCs w:val="22"/>
+              </w:rPr>
+              <w:t>Feb</w:t>
+            </w:r>
+            <w:r>
+              <w:rPr>
+                <w:rFonts w:ascii="Times New Roman" w:eastAsiaTheme="minorEastAsia" w:hAnsi="Times New Roman" w:hint="eastAsia"/>
+                <w:sz w:val="22"/>
+                <w:szCs w:val="22"/>
+                <w:lang w:eastAsia="zh-CN"/>
+              </w:rPr>
+              <w:t xml:space="preserve"> 20</w:t>
+            </w:r>
+            <w:r>
+              <w:rPr>
+                <w:rFonts w:ascii="Times New Roman" w:hAnsi="Times New Roman"/>
+                <w:sz w:val="22"/>
+                <w:szCs w:val="22"/>
+              </w:rPr>
+              <w:t>2</w:t>
+            </w:r>
+            <w:r>
+              <w:rPr>
+                <w:rFonts w:ascii="Times New Roman" w:eastAsiaTheme="minorEastAsia" w:hAnsi="Times New Roman" w:hint="eastAsia"/>
+                <w:sz w:val="22"/>
+                <w:szCs w:val="22"/>
+                <w:lang w:eastAsia="zh-CN"/>
+              </w:rPr>
+              <w:t>7</w:t>
+            </w:r>
+            <w:bookmarkEnd w:id="15"/>
           </w:p>
         </w:tc>
       </w:tr>
@@ -9285,7 +9992,6 @@
                 <w:sz w:val="22"/>
                 <w:szCs w:val="22"/>
               </w:rPr>
-              <w:lastRenderedPageBreak/>
               <w:t xml:space="preserve">Are </w:t>
             </w:r>
             <w:r>
@@ -9812,7 +10518,7 @@
                 <w:sz w:val="22"/>
                 <w:szCs w:val="22"/>
               </w:rPr>
-              <w:t>, complete Phase II of the OOS (initiate Form 3.100.019.F02).</w:t>
+              <w:t xml:space="preserve">, complete Phase II of the OOS (initiate Form 3.100.019.F02).</w:t>
             </w:r>
           </w:p>
           <w:p>
@@ -9914,29 +10620,31 @@
           </w:tcPr>
           <w:p>
             <w:pPr>
-              <w:pStyle w:val="Default"/>
-              <w:jc w:val="both"/>
-              <w:rPr>
-                <w:b/>
-                <w:sz w:val="22"/>
-                <w:szCs w:val="22"/>
-              </w:rPr>
-            </w:pPr>
-            <w:r>
-              <w:rPr>
-                <w:b/>
-                <w:sz w:val="22"/>
-                <w:szCs w:val="22"/>
-              </w:rPr>
+              <w:outlineLvl w:val="0"/>
+              <w:rPr>
+                <w:rFonts w:ascii="Times New Roman" w:hAnsi="Times New Roman"/>
+                <w:bCs/>
+                <w:sz w:val="22"/>
+                <w:szCs w:val="22"/>
+              </w:rPr>
+            </w:pPr>
+            <w:r>
+              <w:rPr>
+                <w:rFonts w:ascii="Times New Roman" w:hAnsi="Times New Roman"/>
+                <w:bCs/>
+                <w:sz w:val="22"/>
+                <w:szCs w:val="22"/>
+              </w:rPr>
+              <w:lastRenderedPageBreak/>
               <w:t xml:space="preserve">Phase I Summary: </w:t>
             </w:r>
           </w:p>
           <w:p>
             <w:pPr>
-              <w:pStyle w:val="Default"/>
-              <w:jc w:val="both"/>
-              <w:rPr>
-                <w:b/>
+              <w:outlineLvl w:val="0"/>
+              <w:rPr>
+                <w:rFonts w:ascii="Times New Roman" w:hAnsi="Times New Roman"/>
+                <w:bCs/>
                 <w:sz w:val="22"/>
                 <w:szCs w:val="22"/>
               </w:rPr>
@@ -9953,31 +10661,13 @@
                 <w:lang w:eastAsia="zh-CN"/>
               </w:rPr>
             </w:pPr>
-            <w:r>
-              <w:rPr>
-                <w:rFonts w:ascii="Times New Roman" w:hAnsi="Times New Roman"/>
-                <w:bCs/>
-                <w:sz w:val="22"/>
-                <w:szCs w:val="22"/>
-              </w:rPr>
-              <w:t>{{ smart_phase1_summary }}</w:t>
-            </w:r>
-          </w:p>
-          <w:p>
-            <w:pPr>
-              <w:outlineLvl w:val="0"/>
-              <w:rPr>
-                <w:rFonts w:eastAsiaTheme="minorEastAsia"/>
-                <w:bCs/>
-              </w:rPr>
-            </w:pPr>
           </w:p>
           <w:p>
             <w:pPr>
               <w:outlineLvl w:val="0"/>
               <w:rPr>
                 <w:rFonts w:ascii="Times New Roman" w:eastAsiaTheme="minorEastAsia" w:hAnsi="Times New Roman"/>
-                <w:color w:val="000000"/>
+                <w:bCs/>
                 <w:sz w:val="22"/>
                 <w:szCs w:val="22"/>
                 <w:lang w:eastAsia="zh-CN"/>
@@ -9986,21 +10676,486 @@
             <w:r>
               <w:rPr>
                 <w:rFonts w:ascii="Times New Roman" w:eastAsiaTheme="minorEastAsia" w:hAnsi="Times New Roman"/>
-                <w:color w:val="000000"/>
+                <w:bCs/>
                 <w:sz w:val="22"/>
                 <w:szCs w:val="22"/>
                 <w:lang w:eastAsia="zh-CN"/>
               </w:rPr>
-              <w:t>{{ smart_phase1_continued }}</w:t>
-            </w:r>
-          </w:p>
-          <w:p>
-            <w:pPr>
-              <w:outlineLvl w:val="0"/>
-              <w:rPr>
-                <w:rFonts w:ascii="Times New Roman" w:hAnsi="Times New Roman"/>
-                <w:sz w:val="22"/>
-                <w:szCs w:val="22"/>
+              <w:t xml:space="preserve">All the analysts involved in the testing, the processing analyst () and the reading analyst who confirmed the positive result (), were interviewed comprehensively. Their answers are recorded throughout this document. </w:t>
+            </w:r>
+          </w:p>
+          <w:p>
+            <w:pPr>
+              <w:outlineLvl w:val="0"/>
+              <w:rPr>
+                <w:rFonts w:ascii="Times New Roman" w:eastAsiaTheme="minorEastAsia" w:hAnsi="Times New Roman"/>
+                <w:bCs/>
+                <w:sz w:val="22"/>
+                <w:szCs w:val="22"/>
+                <w:lang w:eastAsia="zh-CN"/>
+              </w:rPr>
+            </w:pPr>
+          </w:p>
+          <w:p>
+            <w:pPr>
+              <w:outlineLvl w:val="0"/>
+              <w:rPr>
+                <w:rFonts w:ascii="Times New Roman" w:eastAsiaTheme="minorEastAsia" w:hAnsi="Times New Roman"/>
+                <w:bCs/>
+                <w:sz w:val="22"/>
+                <w:szCs w:val="22"/>
+                <w:lang w:eastAsia="zh-CN"/>
+              </w:rPr>
+            </w:pPr>
+            <w:r>
+              <w:rPr>
+                <w:rFonts w:ascii="Times New Roman" w:eastAsiaTheme="minorEastAsia" w:hAnsi="Times New Roman"/>
+                <w:bCs/>
+                <w:sz w:val="22"/>
+                <w:szCs w:val="22"/>
+                <w:lang w:eastAsia="zh-CN"/>
+              </w:rPr>
+              <w:t xml:space="preserve">Upon arrival, the sample was stored in accordance with the Client’s instructions. Analyst  verified the sample’s integrity throughout both the preparation and processing stages. No leaks or turbidity were observed at any point, verifying the integrity of the sample.</w:t>
+            </w:r>
+          </w:p>
+          <w:p>
+            <w:pPr>
+              <w:outlineLvl w:val="0"/>
+              <w:rPr>
+                <w:rFonts w:ascii="Times New Roman" w:eastAsiaTheme="minorEastAsia" w:hAnsi="Times New Roman"/>
+                <w:bCs/>
+                <w:sz w:val="22"/>
+                <w:szCs w:val="22"/>
+                <w:lang w:eastAsia="zh-CN"/>
+              </w:rPr>
+            </w:pPr>
+          </w:p>
+          <w:p>
+            <w:pPr>
+              <w:outlineLvl w:val="0"/>
+              <w:rPr>
+                <w:rFonts w:ascii="Times New Roman" w:eastAsiaTheme="minorEastAsia" w:hAnsi="Times New Roman"/>
+                <w:bCs/>
+                <w:sz w:val="22"/>
+                <w:szCs w:val="22"/>
+                <w:lang w:eastAsia="zh-CN"/>
+              </w:rPr>
+            </w:pPr>
+            <w:r>
+              <w:rPr>
+                <w:rFonts w:ascii="Times New Roman" w:eastAsiaTheme="minorEastAsia" w:hAnsi="Times New Roman"/>
+                <w:bCs/>
+                <w:sz w:val="22"/>
+                <w:szCs w:val="22"/>
+                <w:lang w:eastAsia="zh-CN"/>
+              </w:rPr>
+              <w:t>All reagents and supplies mentioned in the material section above were stored according to the suppliers’ recommendations, and their integrity was visually verified before utilization. Moreover, all reagents and supplies had valid expiration dates. The functionality of all equipment was confirmed by reviewing data generated by our comprehensive in-house continuous monitoring system.</w:t>
+            </w:r>
+          </w:p>
+          <w:p>
+            <w:pPr>
+              <w:outlineLvl w:val="0"/>
+              <w:rPr>
+                <w:rFonts w:ascii="Times New Roman" w:eastAsiaTheme="minorEastAsia" w:hAnsi="Times New Roman"/>
+                <w:bCs/>
+                <w:sz w:val="22"/>
+                <w:szCs w:val="22"/>
+                <w:lang w:eastAsia="zh-CN"/>
+              </w:rPr>
+            </w:pPr>
+          </w:p>
+          <w:p>
+            <w:pPr>
+              <w:outlineLvl w:val="0"/>
+              <w:rPr>
+                <w:rFonts w:ascii="Times New Roman" w:eastAsiaTheme="minorEastAsia" w:hAnsi="Times New Roman"/>
+                <w:bCs/>
+                <w:sz w:val="22"/>
+                <w:szCs w:val="22"/>
+                <w:lang w:eastAsia="zh-CN"/>
+              </w:rPr>
+            </w:pPr>
+            <w:r>
+              <w:rPr>
+                <w:rFonts w:ascii="Times New Roman" w:eastAsiaTheme="minorEastAsia" w:hAnsi="Times New Roman"/>
+                <w:bCs/>
+                <w:sz w:val="22"/>
+                <w:szCs w:val="22"/>
+                <w:lang w:eastAsia="zh-CN"/>
+              </w:rPr>
+              <w:t xml:space="preserve"/>
+            </w:r>
+          </w:p>
+          <w:p>
+            <w:pPr>
+              <w:outlineLvl w:val="0"/>
+              <w:rPr>
+                <w:rFonts w:ascii="Times New Roman" w:eastAsiaTheme="minorEastAsia" w:hAnsi="Times New Roman"/>
+                <w:bCs/>
+                <w:sz w:val="22"/>
+                <w:szCs w:val="22"/>
+                <w:lang w:eastAsia="zh-CN"/>
+              </w:rPr>
+            </w:pPr>
+          </w:p>
+          <w:p>
+            <w:pPr>
+              <w:outlineLvl w:val="0"/>
+              <w:rPr>
+                <w:rFonts w:ascii="Times New Roman" w:eastAsiaTheme="minorEastAsia" w:hAnsi="Times New Roman"/>
+                <w:bCs/>
+                <w:sz w:val="22"/>
+                <w:szCs w:val="22"/>
+                <w:lang w:eastAsia="zh-CN"/>
+              </w:rPr>
+            </w:pPr>
+            <w:r>
+              <w:rPr>
+                <w:rFonts w:ascii="Times New Roman" w:eastAsiaTheme="minorEastAsia" w:hAnsi="Times New Roman"/>
+                <w:bCs/>
+                <w:sz w:val="22"/>
+                <w:szCs w:val="22"/>
+                <w:lang w:eastAsia="zh-CN"/>
+              </w:rPr>
+              <w:t xml:space="preserve">On , the sample vials for  were received from the Sample Submissions team and brought into the Sterile Microbiology lab. Upon arrival, each sample vial was sprayed with an acidified bleach disinfectant, placed into pre-disinfected bins, and allowed a 10-minute contact time. The secondary disinfection happened in the ISO 8 anteroom (Suite )), where the vials were again treated with acidified bleach and provided a 10‑minute contact time before processing. Subsequently, the vials were moved into the ISO 7 cleanroom Suite (). Inside this cleanroom, the processing analyst, , performed a final disinfection step, allowing an additional 10-minute contact time. Once fully disinfected, the vials were transferred into the ISO 5 BSC E00.</w:t>
+            </w:r>
+          </w:p>
+          <w:p>
+            <w:pPr>
+              <w:outlineLvl w:val="0"/>
+              <w:rPr>
+                <w:rFonts w:ascii="Times New Roman" w:eastAsiaTheme="minorEastAsia" w:hAnsi="Times New Roman"/>
+                <w:bCs/>
+                <w:sz w:val="22"/>
+                <w:szCs w:val="22"/>
+                <w:lang w:eastAsia="zh-CN"/>
+              </w:rPr>
+            </w:pPr>
+          </w:p>
+          <w:p>
+            <w:pPr>
+              <w:outlineLvl w:val="0"/>
+              <w:rPr>
+                <w:rFonts w:ascii="Times New Roman" w:eastAsiaTheme="minorEastAsia" w:hAnsi="Times New Roman"/>
+                <w:bCs/>
+                <w:sz w:val="22"/>
+                <w:szCs w:val="22"/>
+                <w:lang w:eastAsia="zh-CN"/>
+              </w:rPr>
+            </w:pPr>
+            <w:r>
+              <w:rPr>
+                <w:rFonts w:ascii="Times New Roman" w:eastAsiaTheme="minorEastAsia" w:hAnsi="Times New Roman"/>
+                <w:bCs/>
+                <w:sz w:val="22"/>
+                <w:szCs w:val="22"/>
+                <w:lang w:eastAsia="zh-CN"/>
+              </w:rPr>
+              <w:t xml:space="preserve">Once transferred into the ISO 5 BSC, the vials were placed on the disinfected working surface of the BSC E00 and aseptically opened and tested in accordance with SOP 2.600.008 (USP / EP 2.6.1 Sterility Test). Following testing, the media bottles were subsequently transferred into designated incubators, E001356 and E001357, to initiate incubation. </w:t>
+            </w:r>
+          </w:p>
+          <w:p>
+            <w:pPr>
+              <w:outlineLvl w:val="0"/>
+              <w:rPr>
+                <w:rFonts w:ascii="Times New Roman" w:eastAsiaTheme="minorEastAsia" w:hAnsi="Times New Roman"/>
+                <w:bCs/>
+                <w:sz w:val="22"/>
+                <w:szCs w:val="22"/>
+                <w:lang w:eastAsia="zh-CN"/>
+              </w:rPr>
+            </w:pPr>
+          </w:p>
+          <w:p>
+            <w:pPr>
+              <w:outlineLvl w:val="0"/>
+              <w:rPr>
+                <w:rFonts w:ascii="Times New Roman" w:eastAsiaTheme="minorEastAsia" w:hAnsi="Times New Roman"/>
+                <w:bCs/>
+                <w:sz w:val="22"/>
+                <w:szCs w:val="22"/>
+                <w:lang w:eastAsia="zh-CN"/>
+              </w:rPr>
+            </w:pPr>
+            <w:r>
+              <w:rPr>
+                <w:rFonts w:ascii="Times New Roman" w:eastAsiaTheme="minorEastAsia" w:hAnsi="Times New Roman"/>
+                <w:bCs/>
+                <w:sz w:val="22"/>
+                <w:szCs w:val="22"/>
+                <w:lang w:eastAsia="zh-CN"/>
+              </w:rPr>
+              <w:t xml:space="preserve">On  (Day  of incubation), microbial growth was observed in  media bottle by analyst  and confirmed by Microbiology Lab Supervisor Robin Seymour. The organism was identified as  (see Table 1).</w:t>
+            </w:r>
+          </w:p>
+          <w:p>
+            <w:pPr>
+              <w:outlineLvl w:val="0"/>
+              <w:rPr>
+                <w:rFonts w:ascii="Times New Roman" w:eastAsiaTheme="minorEastAsia" w:hAnsi="Times New Roman"/>
+                <w:bCs/>
+                <w:sz w:val="22"/>
+                <w:szCs w:val="22"/>
+                <w:lang w:eastAsia="zh-CN"/>
+              </w:rPr>
+            </w:pPr>
+            <w:r>
+              <w:rPr>
+                <w:rFonts w:ascii="Times New Roman" w:eastAsiaTheme="minorEastAsia" w:hAnsi="Times New Roman"/>
+                <w:bCs/>
+                <w:sz w:val="22"/>
+                <w:szCs w:val="22"/>
+                <w:lang w:eastAsia="zh-CN"/>
+              </w:rPr>
+              <w:t xml:space="preserve"> </w:t>
+            </w:r>
+          </w:p>
+          <w:p>
+            <w:pPr>
+              <w:outlineLvl w:val="0"/>
+              <w:rPr>
+                <w:rFonts w:ascii="Times New Roman" w:eastAsiaTheme="minorEastAsia" w:hAnsi="Times New Roman"/>
+                <w:bCs/>
+                <w:sz w:val="22"/>
+                <w:szCs w:val="22"/>
+                <w:lang w:eastAsia="zh-CN"/>
+              </w:rPr>
+            </w:pPr>
+            <w:r>
+              <w:rPr>
+                <w:rFonts w:ascii="Times New Roman" w:eastAsiaTheme="minorEastAsia" w:hAnsi="Times New Roman"/>
+                <w:bCs/>
+                <w:sz w:val="22"/>
+                <w:szCs w:val="22"/>
+                <w:lang w:eastAsia="zh-CN"/>
+              </w:rPr>
+              <w:t xml:space="preserve">The culture media used were within expiry. Negative control media bottles were processed and incubated under identical conditions and showed no microbial growth, confirming the integrity of the test procedure.</w:t>
+            </w:r>
+          </w:p>
+          <w:p>
+            <w:pPr>
+              <w:outlineLvl w:val="0"/>
+              <w:rPr>
+                <w:rFonts w:ascii="Times New Roman" w:eastAsiaTheme="minorEastAsia" w:hAnsi="Times New Roman"/>
+                <w:bCs/>
+                <w:sz w:val="22"/>
+                <w:szCs w:val="22"/>
+                <w:lang w:eastAsia="zh-CN"/>
+              </w:rPr>
+            </w:pPr>
+          </w:p>
+          <w:p>
+            <w:pPr>
+              <w:outlineLvl w:val="0"/>
+              <w:rPr>
+                <w:rFonts w:ascii="Times New Roman" w:eastAsiaTheme="minorEastAsia" w:hAnsi="Times New Roman"/>
+                <w:bCs/>
+                <w:sz w:val="22"/>
+                <w:szCs w:val="22"/>
+                <w:lang w:eastAsia="zh-CN"/>
+              </w:rPr>
+            </w:pPr>
+            <w:r>
+              <w:rPr>
+                <w:rFonts w:ascii="Times New Roman" w:eastAsiaTheme="minorEastAsia" w:hAnsi="Times New Roman"/>
+                <w:bCs/>
+                <w:sz w:val="22"/>
+                <w:szCs w:val="22"/>
+                <w:lang w:eastAsia="zh-CN"/>
+              </w:rPr>
+              <w:t xml:space="preserve"> </w:t>
+            </w:r>
+          </w:p>
+          <w:p>
+            <w:pPr>
+              <w:outlineLvl w:val="0"/>
+              <w:rPr>
+                <w:rFonts w:ascii="Times New Roman" w:eastAsiaTheme="minorEastAsia" w:hAnsi="Times New Roman"/>
+                <w:bCs/>
+                <w:sz w:val="22"/>
+                <w:szCs w:val="22"/>
+                <w:lang w:eastAsia="zh-CN"/>
+              </w:rPr>
+            </w:pPr>
+          </w:p>
+          <w:p>
+            <w:pPr>
+              <w:outlineLvl w:val="0"/>
+              <w:rPr>
+                <w:rFonts w:ascii="Times New Roman" w:eastAsiaTheme="minorEastAsia" w:hAnsi="Times New Roman"/>
+                <w:bCs/>
+                <w:sz w:val="22"/>
+                <w:szCs w:val="22"/>
+                <w:lang w:eastAsia="zh-CN"/>
+              </w:rPr>
+            </w:pPr>
+            <w:r>
+              <w:rPr>
+                <w:rFonts w:ascii="Times New Roman" w:eastAsiaTheme="minorEastAsia" w:hAnsi="Times New Roman"/>
+                <w:bCs/>
+                <w:sz w:val="22"/>
+                <w:szCs w:val="22"/>
+                <w:lang w:eastAsia="zh-CN"/>
+              </w:rPr>
+              <w:t xml:space="preserve">The analysts confirmed full compliance with cleaning procedures as outlined in SOPs 2.600.018 (Cleaning and Disinfecting Procedure for Microbiology) and 2.600.008 (USP &lt;71&gt; / EP 2.6.1 Sterility Test). </w:t>
+            </w:r>
+          </w:p>
+          <w:p>
+            <w:pPr>
+              <w:outlineLvl w:val="0"/>
+              <w:rPr>
+                <w:rFonts w:ascii="Times New Roman" w:eastAsiaTheme="minorEastAsia" w:hAnsi="Times New Roman"/>
+                <w:bCs/>
+                <w:sz w:val="22"/>
+                <w:szCs w:val="22"/>
+                <w:lang w:eastAsia="zh-CN"/>
+              </w:rPr>
+            </w:pPr>
+          </w:p>
+          <w:p>
+            <w:pPr>
+              <w:outlineLvl w:val="0"/>
+              <w:rPr>
+                <w:rFonts w:ascii="Times New Roman" w:eastAsiaTheme="minorEastAsia" w:hAnsi="Times New Roman"/>
+                <w:bCs/>
+                <w:sz w:val="22"/>
+                <w:szCs w:val="22"/>
+                <w:lang w:eastAsia="zh-CN"/>
+              </w:rPr>
+            </w:pPr>
+            <w:r>
+              <w:rPr>
+                <w:rFonts w:ascii="Times New Roman" w:eastAsiaTheme="minorEastAsia" w:hAnsi="Times New Roman"/>
+                <w:bCs/>
+                <w:sz w:val="22"/>
+                <w:szCs w:val="22"/>
+                <w:lang w:eastAsia="zh-CN"/>
+              </w:rPr>
+              <w:t xml:space="preserve">Monthly cleaning and disinfection of the outermost ISO 8 Anteroom, the middle ISO 7 Buffer room, the innermost ISO 7 cleanroom, and its containing ISO 5 Biosafety Cabinets for CR  was performed on , as per SOP 2.600.018 (Cleaning and Disinfecting Procedure for Microbiology) During </w:t>
+            </w:r>
+            <w:r>
+              <w:rPr>
+                <w:rFonts w:ascii="Times New Roman" w:eastAsiaTheme="minorEastAsia" w:hAnsi="Times New Roman"/>
+                <w:bCs/>
+                <w:sz w:val="22"/>
+                <w:szCs w:val="22"/>
+                <w:lang w:eastAsia="zh-CN"/>
+              </w:rPr>
+              <w:lastRenderedPageBreak/>
+              <w:t xml:space="preserve">both cleaning cycles, it was documented that all H₂O₂ indicators passed. This confirms the efficient monthly cleaning of all three parts of Cleanrooms . </w:t>
+            </w:r>
+          </w:p>
+          <w:p>
+            <w:pPr>
+              <w:outlineLvl w:val="0"/>
+              <w:rPr>
+                <w:rFonts w:ascii="Times New Roman" w:eastAsiaTheme="minorEastAsia" w:hAnsi="Times New Roman"/>
+                <w:bCs/>
+                <w:sz w:val="22"/>
+                <w:szCs w:val="22"/>
+                <w:lang w:eastAsia="zh-CN"/>
+              </w:rPr>
+            </w:pPr>
+          </w:p>
+          <w:p>
+            <w:pPr>
+              <w:outlineLvl w:val="0"/>
+              <w:rPr>
+                <w:rFonts w:ascii="Times New Roman" w:eastAsiaTheme="minorEastAsia" w:hAnsi="Times New Roman"/>
+                <w:bCs/>
+                <w:sz w:val="22"/>
+                <w:szCs w:val="22"/>
+                <w:lang w:eastAsia="zh-CN"/>
+              </w:rPr>
+            </w:pPr>
+            <w:r>
+              <w:rPr>
+                <w:rFonts w:ascii="Times New Roman" w:eastAsiaTheme="minorEastAsia" w:hAnsi="Times New Roman"/>
+                <w:bCs/>
+                <w:sz w:val="22"/>
+                <w:szCs w:val="22"/>
+                <w:lang w:eastAsia="zh-CN"/>
+              </w:rPr>
+              <w:t xml:space="preserve"/>
+            </w:r>
+          </w:p>
+          <w:p>
+            <w:pPr>
+              <w:outlineLvl w:val="0"/>
+              <w:rPr>
+                <w:rFonts w:ascii="Times New Roman" w:eastAsiaTheme="minorEastAsia" w:hAnsi="Times New Roman"/>
+                <w:bCs/>
+                <w:sz w:val="22"/>
+                <w:szCs w:val="22"/>
+                <w:lang w:eastAsia="zh-CN"/>
+              </w:rPr>
+            </w:pPr>
+          </w:p>
+          <w:p>
+            <w:pPr>
+              <w:outlineLvl w:val="0"/>
+              <w:rPr>
+                <w:rFonts w:ascii="Times New Roman" w:eastAsiaTheme="minorEastAsia" w:hAnsi="Times New Roman"/>
+                <w:bCs/>
+                <w:sz w:val="22"/>
+                <w:szCs w:val="22"/>
+                <w:lang w:eastAsia="zh-CN"/>
+              </w:rPr>
+            </w:pPr>
+            <w:r>
+              <w:rPr>
+                <w:rFonts w:ascii="Times New Roman" w:eastAsiaTheme="minorEastAsia" w:hAnsi="Times New Roman"/>
+                <w:bCs/>
+                <w:sz w:val="22"/>
+                <w:szCs w:val="22"/>
+                <w:lang w:eastAsia="zh-CN"/>
+              </w:rPr>
+              <w:t xml:space="preserve">To assess the potential for sample-to-sample contamination contributing to the positive results, a comprehensive review was conducted of all samples processed on the same day. </w:t>
+            </w:r>
+          </w:p>
+          <w:p>
+            <w:pPr>
+              <w:outlineLvl w:val="0"/>
+              <w:rPr>
+                <w:rFonts w:ascii="Times New Roman" w:eastAsiaTheme="minorEastAsia" w:hAnsi="Times New Roman"/>
+                <w:bCs/>
+                <w:sz w:val="22"/>
+                <w:szCs w:val="22"/>
+                <w:lang w:eastAsia="zh-CN"/>
+              </w:rPr>
+            </w:pPr>
+          </w:p>
+          <w:p>
+            <w:pPr>
+              <w:outlineLvl w:val="0"/>
+              <w:rPr>
+                <w:rFonts w:ascii="Times New Roman" w:eastAsiaTheme="minorEastAsia" w:hAnsi="Times New Roman"/>
+                <w:bCs/>
+                <w:sz w:val="22"/>
+                <w:szCs w:val="22"/>
+                <w:lang w:eastAsia="zh-CN"/>
+              </w:rPr>
+            </w:pPr>
+            <w:r>
+              <w:rPr>
+                <w:rFonts w:ascii="Times New Roman" w:eastAsiaTheme="minorEastAsia" w:hAnsi="Times New Roman"/>
+                <w:bCs/>
+                <w:sz w:val="22"/>
+                <w:szCs w:val="22"/>
+                <w:lang w:eastAsia="zh-CN"/>
+              </w:rPr>
+              <w:t>Based on the observations outlined above, it is unlikely that the failing results were due to reagents, supplies, the cleanroom environment, the process, or analyst involvement. Consequently, the possibility of laboratory error contributing to this failure is minimal and the original result is deemed to be valid.</w:t>
+            </w:r>
+          </w:p>
+          <w:p>
+            <w:pPr>
+              <w:outlineLvl w:val="0"/>
+              <w:rPr>
+                <w:rFonts w:ascii="Times New Roman" w:eastAsiaTheme="minorEastAsia" w:hAnsi="Times New Roman"/>
+                <w:bCs/>
+                <w:sz w:val="22"/>
+                <w:szCs w:val="22"/>
+                <w:lang w:eastAsia="zh-CN"/>
               </w:rPr>
             </w:pPr>
           </w:p>
@@ -10033,6 +11188,7 @@
                 <w:sz w:val="22"/>
                 <w:szCs w:val="22"/>
               </w:rPr>
+              <w:lastRenderedPageBreak/>
               <w:t>Reviewer Comments:</w:t>
             </w:r>
           </w:p>
@@ -10956,8 +12112,6 @@
         </w:tc>
       </w:tr>
     </w:tbl>
-    <w:p/>
-    <w:p/>
     <w:p>
       <w:pPr>
         <w:rPr>
@@ -11028,7 +12182,7 @@
           <w:szCs w:val="18"/>
           <w:u w:val="single"/>
         </w:rPr>
-        <w:t>{{ sample_id }}</w:t>
+        <w:t xml:space="preserve"/>
       </w:r>
       <w:r>
         <w:rPr>
@@ -11342,7 +12496,7 @@
                 <w:sz w:val="14"/>
                 <w:szCs w:val="14"/>
               </w:rPr>
-              <w:t>{{ analyst_name }}</w:t>
+              <w:t xml:space="preserve"/>
             </w:r>
           </w:p>
         </w:tc>
@@ -11367,7 +12521,7 @@
                 <w:sz w:val="14"/>
                 <w:szCs w:val="14"/>
               </w:rPr>
-              <w:t>{{ reader_name }}</w:t>
+              <w:t xml:space="preserve"/>
             </w:r>
           </w:p>
         </w:tc>
@@ -11394,7 +12548,7 @@
                 <w:sz w:val="14"/>
                 <w:szCs w:val="14"/>
               </w:rPr>
-              <w:t>{{ sample_id }}</w:t>
+              <w:t xml:space="preserve"/>
             </w:r>
           </w:p>
         </w:tc>
@@ -11420,7 +12574,7 @@
                 <w:sz w:val="14"/>
                 <w:szCs w:val="14"/>
               </w:rPr>
-              <w:t>{{positive_id}}</w:t>
+              <w:t xml:space="preserve"/>
             </w:r>
           </w:p>
         </w:tc>
@@ -11446,23 +12600,7 @@
                 <w:sz w:val="14"/>
                 <w:szCs w:val="14"/>
               </w:rPr>
-              <w:t xml:space="preserve">{{ </w:t>
-            </w:r>
-            <w:r>
-              <w:rPr>
-                <w:rFonts w:eastAsiaTheme="minorEastAsia" w:hint="eastAsia"/>
-                <w:sz w:val="14"/>
-                <w:szCs w:val="14"/>
-                <w:lang w:eastAsia="zh-CN"/>
-              </w:rPr>
-              <w:t>positive_media</w:t>
-            </w:r>
-            <w:r>
-              <w:rPr>
-                <w:sz w:val="14"/>
-                <w:szCs w:val="14"/>
-              </w:rPr>
-              <w:t>}}</w:t>
+              <w:t xml:space="preserve"/>
             </w:r>
           </w:p>
         </w:tc>
@@ -11488,21 +12626,7 @@
                 <w:sz w:val="14"/>
                 <w:szCs w:val="14"/>
               </w:rPr>
-              <w:t xml:space="preserve">{{ </w:t>
-            </w:r>
-            <w:r>
-              <w:rPr>
-                <w:sz w:val="14"/>
-                <w:szCs w:val="14"/>
-              </w:rPr>
-              <w:t>positive_org</w:t>
-            </w:r>
-            <w:r>
-              <w:rPr>
-                <w:sz w:val="14"/>
-                <w:szCs w:val="14"/>
-              </w:rPr>
-              <w:t xml:space="preserve"> }}</w:t>
+              <w:t xml:space="preserve"/>
             </w:r>
           </w:p>
         </w:tc>
@@ -11561,7 +12685,7 @@
           <w:szCs w:val="18"/>
           <w:u w:val="single"/>
         </w:rPr>
-        <w:t>Testing</w:t>
+        <w:t xml:space="preserve">Testing</w:t>
       </w:r>
       <w:r>
         <w:rPr>
@@ -11581,28 +12705,7 @@
           <w:szCs w:val="18"/>
           <w:u w:val="single"/>
         </w:rPr>
-        <w:t xml:space="preserve">{{ </w:t>
-      </w:r>
-      <w:r>
-        <w:rPr>
-          <w:rFonts w:ascii="Times New Roman" w:eastAsiaTheme="minorEastAsia" w:hAnsi="Times New Roman" w:hint="eastAsia"/>
-          <w:bCs/>
-          <w:sz w:val="18"/>
-          <w:szCs w:val="18"/>
-          <w:u w:val="single"/>
-          <w:lang w:eastAsia="zh-CN"/>
-        </w:rPr>
-        <w:t>process</w:t>
-      </w:r>
-      <w:r>
-        <w:rPr>
-          <w:rFonts w:ascii="Times New Roman" w:hAnsi="Times New Roman"/>
-          <w:bCs/>
-          <w:sz w:val="18"/>
-          <w:szCs w:val="18"/>
-          <w:u w:val="single"/>
-        </w:rPr>
-        <w:t>_date }}</w:t>
+        <w:t xml:space="preserve"/>
       </w:r>
     </w:p>
     <w:p>
@@ -12133,7 +13236,7 @@
                 <w:sz w:val="14"/>
                 <w:szCs w:val="14"/>
               </w:rPr>
-              <w:t>{{ test_date }}</w:t>
+              <w:t xml:space="preserve"/>
             </w:r>
           </w:p>
         </w:tc>
@@ -12172,7 +13275,7 @@
                 <w:sz w:val="14"/>
                 <w:szCs w:val="14"/>
               </w:rPr>
-              <w:t>{{ analyst_initial }}</w:t>
+              <w:t xml:space="preserve"/>
             </w:r>
           </w:p>
         </w:tc>
@@ -12248,7 +13351,7 @@
                 <w:sz w:val="14"/>
                 <w:szCs w:val="14"/>
               </w:rPr>
-              <w:t>{{ obs_pers_dur }}</w:t>
+              <w:t xml:space="preserve"/>
             </w:r>
           </w:p>
         </w:tc>
@@ -12286,7 +13389,7 @@
                 <w:sz w:val="14"/>
                 <w:szCs w:val="14"/>
               </w:rPr>
-              <w:t>{{ etx_pers_dur }}</w:t>
+              <w:t xml:space="preserve"/>
             </w:r>
           </w:p>
         </w:tc>
@@ -12323,7 +13426,7 @@
                 <w:sz w:val="14"/>
                 <w:szCs w:val="14"/>
               </w:rPr>
-              <w:t>{{ id_pers_dur }}</w:t>
+              <w:t xml:space="preserve"/>
             </w:r>
           </w:p>
         </w:tc>
@@ -12485,7 +13588,7 @@
                 <w:sz w:val="14"/>
                 <w:szCs w:val="14"/>
               </w:rPr>
-              <w:t>{{ test_date }}</w:t>
+              <w:t xml:space="preserve"/>
             </w:r>
           </w:p>
         </w:tc>
@@ -12523,7 +13626,7 @@
                 <w:sz w:val="14"/>
                 <w:szCs w:val="14"/>
               </w:rPr>
-              <w:t>{{ analyst_initial }}</w:t>
+              <w:t xml:space="preserve"/>
             </w:r>
           </w:p>
         </w:tc>
@@ -12599,7 +13702,7 @@
                 <w:sz w:val="14"/>
                 <w:szCs w:val="14"/>
               </w:rPr>
-              <w:t>{{ obs_pers_dur }}</w:t>
+              <w:t xml:space="preserve"/>
             </w:r>
           </w:p>
         </w:tc>
@@ -12637,7 +13740,7 @@
                 <w:sz w:val="14"/>
                 <w:szCs w:val="14"/>
               </w:rPr>
-              <w:t>{{ etx_pers_dur }}</w:t>
+              <w:t xml:space="preserve"/>
             </w:r>
           </w:p>
         </w:tc>
@@ -12674,7 +13777,7 @@
                 <w:sz w:val="14"/>
                 <w:szCs w:val="14"/>
               </w:rPr>
-              <w:t>{{ id_pers_dur }}</w:t>
+              <w:t xml:space="preserve"/>
             </w:r>
           </w:p>
         </w:tc>
@@ -12776,7 +13879,7 @@
                 <w:sz w:val="14"/>
                 <w:szCs w:val="14"/>
               </w:rPr>
-              <w:t>{{ bsc_id }}</w:t>
+              <w:t xml:space="preserve"/>
             </w:r>
             <w:r>
               <w:rPr>
@@ -12863,16 +13966,16 @@
                 <w:sz w:val="14"/>
                 <w:szCs w:val="14"/>
               </w:rPr>
-              <w:t>E00</w:t>
-            </w:r>
-            <w:r>
-              <w:rPr>
-                <w:rFonts w:ascii="Times New Roman" w:hAnsi="Times New Roman"/>
-                <w:color w:val="000000" w:themeColor="text1"/>
-                <w:sz w:val="14"/>
-                <w:szCs w:val="14"/>
-              </w:rPr>
-              <w:t xml:space="preserve">{{ bsc_id }} </w:t>
+              <w:t xml:space="preserve">E00</w:t>
+            </w:r>
+            <w:r>
+              <w:rPr>
+                <w:rFonts w:ascii="Times New Roman" w:hAnsi="Times New Roman"/>
+                <w:color w:val="000000" w:themeColor="text1"/>
+                <w:sz w:val="14"/>
+                <w:szCs w:val="14"/>
+              </w:rPr>
+              <w:t xml:space="preserve"> </w:t>
             </w:r>
             <w:r>
               <w:rPr>
@@ -12949,7 +14052,7 @@
                 <w:sz w:val="14"/>
                 <w:szCs w:val="14"/>
               </w:rPr>
-              <w:t>{{ test_date }}</w:t>
+              <w:t xml:space="preserve"/>
             </w:r>
           </w:p>
         </w:tc>
@@ -12987,7 +14090,7 @@
                 <w:sz w:val="14"/>
                 <w:szCs w:val="14"/>
               </w:rPr>
-              <w:t>{{ analyst_initial }}</w:t>
+              <w:t xml:space="preserve"/>
             </w:r>
           </w:p>
         </w:tc>
@@ -13063,7 +14166,7 @@
                 <w:sz w:val="14"/>
                 <w:szCs w:val="14"/>
               </w:rPr>
-              <w:t>{{ obs_surf_dur }}</w:t>
+              <w:t xml:space="preserve"/>
             </w:r>
           </w:p>
         </w:tc>
@@ -13101,7 +14204,7 @@
                 <w:sz w:val="14"/>
                 <w:szCs w:val="14"/>
               </w:rPr>
-              <w:t>{{ etx_surf_dur }}</w:t>
+              <w:t xml:space="preserve"/>
             </w:r>
           </w:p>
         </w:tc>
@@ -13138,7 +14241,7 @@
                 <w:sz w:val="14"/>
                 <w:szCs w:val="14"/>
               </w:rPr>
-              <w:t>{{ id_surf_dur }}</w:t>
+              <w:t xml:space="preserve"/>
             </w:r>
           </w:p>
         </w:tc>
@@ -13334,7 +14437,7 @@
                 <w:sz w:val="14"/>
                 <w:szCs w:val="14"/>
               </w:rPr>
-              <w:t>{{ test_date }}</w:t>
+              <w:t xml:space="preserve"/>
             </w:r>
           </w:p>
         </w:tc>
@@ -13372,25 +14475,7 @@
                 <w:sz w:val="14"/>
                 <w:szCs w:val="14"/>
               </w:rPr>
-              <w:t xml:space="preserve">{{ </w:t>
-            </w:r>
-            <w:r>
-              <w:rPr>
-                <w:rFonts w:ascii="Times New Roman" w:hAnsi="Times New Roman"/>
-                <w:color w:val="000000" w:themeColor="text1"/>
-                <w:sz w:val="14"/>
-                <w:szCs w:val="14"/>
-              </w:rPr>
-              <w:t>aliquoting_initial</w:t>
-            </w:r>
-            <w:r>
-              <w:rPr>
-                <w:rFonts w:ascii="Times New Roman" w:hAnsi="Times New Roman"/>
-                <w:color w:val="000000" w:themeColor="text1"/>
-                <w:sz w:val="14"/>
-                <w:szCs w:val="14"/>
-              </w:rPr>
-              <w:t xml:space="preserve"> }}</w:t>
+              <w:t xml:space="preserve"/>
             </w:r>
           </w:p>
         </w:tc>
@@ -13466,7 +14551,7 @@
                 <w:sz w:val="14"/>
                 <w:szCs w:val="14"/>
               </w:rPr>
-              <w:t>{{ obs_surf_dur }}</w:t>
+              <w:t xml:space="preserve"/>
             </w:r>
           </w:p>
         </w:tc>
@@ -13504,7 +14589,7 @@
                 <w:sz w:val="14"/>
                 <w:szCs w:val="14"/>
               </w:rPr>
-              <w:t>{{ etx_surf_dur }}</w:t>
+              <w:t xml:space="preserve"/>
             </w:r>
           </w:p>
         </w:tc>
@@ -13541,7 +14626,7 @@
                 <w:sz w:val="14"/>
                 <w:szCs w:val="14"/>
               </w:rPr>
-              <w:t>{{ id_surf_dur }}</w:t>
+              <w:t xml:space="preserve"/>
             </w:r>
           </w:p>
         </w:tc>
@@ -13627,16 +14712,16 @@
                 <w:sz w:val="14"/>
                 <w:szCs w:val="14"/>
               </w:rPr>
-              <w:t>E00</w:t>
-            </w:r>
-            <w:r>
-              <w:rPr>
-                <w:rFonts w:ascii="Times New Roman" w:hAnsi="Times New Roman"/>
-                <w:color w:val="000000" w:themeColor="text1"/>
-                <w:sz w:val="14"/>
-                <w:szCs w:val="14"/>
-              </w:rPr>
-              <w:t xml:space="preserve">{{ bsc_id }} </w:t>
+              <w:t xml:space="preserve">E00</w:t>
+            </w:r>
+            <w:r>
+              <w:rPr>
+                <w:rFonts w:ascii="Times New Roman" w:hAnsi="Times New Roman"/>
+                <w:color w:val="000000" w:themeColor="text1"/>
+                <w:sz w:val="14"/>
+                <w:szCs w:val="14"/>
+              </w:rPr>
+              <w:t xml:space="preserve"> </w:t>
             </w:r>
             <w:r>
               <w:rPr>
@@ -13713,7 +14798,7 @@
                 <w:sz w:val="14"/>
                 <w:szCs w:val="14"/>
               </w:rPr>
-              <w:t>{{ test_date }}</w:t>
+              <w:t xml:space="preserve"/>
             </w:r>
           </w:p>
         </w:tc>
@@ -13751,7 +14836,7 @@
                 <w:sz w:val="14"/>
                 <w:szCs w:val="14"/>
               </w:rPr>
-              <w:t>{{ analyst_initial }}</w:t>
+              <w:t xml:space="preserve"/>
             </w:r>
           </w:p>
         </w:tc>
@@ -13827,7 +14912,7 @@
                 <w:sz w:val="14"/>
                 <w:szCs w:val="14"/>
               </w:rPr>
-              <w:t>{{ obs_sett_dur }}</w:t>
+              <w:t xml:space="preserve"/>
             </w:r>
           </w:p>
         </w:tc>
@@ -13865,7 +14950,7 @@
                 <w:sz w:val="14"/>
                 <w:szCs w:val="14"/>
               </w:rPr>
-              <w:t>{{ etx_sett_dur }}</w:t>
+              <w:t xml:space="preserve"/>
             </w:r>
           </w:p>
         </w:tc>
@@ -13902,7 +14987,7 @@
                 <w:sz w:val="14"/>
                 <w:szCs w:val="14"/>
               </w:rPr>
-              <w:t>{{ id_sett_dur }}</w:t>
+              <w:t xml:space="preserve"/>
             </w:r>
           </w:p>
         </w:tc>
@@ -14071,7 +15156,7 @@
                 <w:sz w:val="14"/>
                 <w:szCs w:val="14"/>
               </w:rPr>
-              <w:t>{{ test_date }}</w:t>
+              <w:t xml:space="preserve"/>
             </w:r>
           </w:p>
         </w:tc>
@@ -14109,25 +15194,7 @@
                 <w:sz w:val="14"/>
                 <w:szCs w:val="14"/>
               </w:rPr>
-              <w:t xml:space="preserve">{{ </w:t>
-            </w:r>
-            <w:r>
-              <w:rPr>
-                <w:rFonts w:ascii="Times New Roman" w:hAnsi="Times New Roman"/>
-                <w:color w:val="000000" w:themeColor="text1"/>
-                <w:sz w:val="14"/>
-                <w:szCs w:val="14"/>
-              </w:rPr>
-              <w:t>aliquoting_initial</w:t>
-            </w:r>
-            <w:r>
-              <w:rPr>
-                <w:rFonts w:ascii="Times New Roman" w:hAnsi="Times New Roman"/>
-                <w:color w:val="000000" w:themeColor="text1"/>
-                <w:sz w:val="14"/>
-                <w:szCs w:val="14"/>
-              </w:rPr>
-              <w:t xml:space="preserve"> }}</w:t>
+              <w:t xml:space="preserve"/>
             </w:r>
           </w:p>
         </w:tc>
@@ -14203,7 +15270,7 @@
                 <w:sz w:val="14"/>
                 <w:szCs w:val="14"/>
               </w:rPr>
-              <w:t>{{ obs_sett_dur }}</w:t>
+              <w:t xml:space="preserve"/>
             </w:r>
           </w:p>
         </w:tc>
@@ -14241,7 +15308,7 @@
                 <w:sz w:val="14"/>
                 <w:szCs w:val="14"/>
               </w:rPr>
-              <w:t>{{ etx_sett_dur }}</w:t>
+              <w:t xml:space="preserve"/>
             </w:r>
           </w:p>
         </w:tc>
@@ -14278,7 +15345,7 @@
                 <w:sz w:val="14"/>
                 <w:szCs w:val="14"/>
               </w:rPr>
-              <w:t>{{ id_sett_dur }}</w:t>
+              <w:t xml:space="preserve"/>
             </w:r>
           </w:p>
         </w:tc>
@@ -14365,7 +15432,7 @@
                 <w:sz w:val="14"/>
                 <w:szCs w:val="14"/>
               </w:rPr>
-              <w:t>{{ cr_suit }}</w:t>
+              <w:t xml:space="preserve"/>
             </w:r>
             <w:r>
               <w:rPr>
@@ -14387,7 +15454,7 @@
                 <w:sz w:val="14"/>
                 <w:szCs w:val="14"/>
               </w:rPr>
-              <w:t>{{ cr_id }}</w:t>
+              <w:t xml:space="preserve"/>
             </w:r>
           </w:p>
         </w:tc>
@@ -14739,7 +15806,7 @@
                 <w:sz w:val="14"/>
                 <w:szCs w:val="14"/>
               </w:rPr>
-              <w:t>{{ date_of_weekly }}</w:t>
+              <w:t xml:space="preserve"/>
             </w:r>
           </w:p>
         </w:tc>
@@ -14772,7 +15839,7 @@
                 <w:sz w:val="14"/>
                 <w:szCs w:val="14"/>
               </w:rPr>
-              <w:t>{{ weekly_initial }}</w:t>
+              <w:t xml:space="preserve"/>
             </w:r>
           </w:p>
         </w:tc>
@@ -14805,7 +15872,7 @@
                 <w:sz w:val="14"/>
                 <w:szCs w:val="14"/>
               </w:rPr>
-              <w:t>{{ obs_air_wk_of }}</w:t>
+              <w:t xml:space="preserve"/>
             </w:r>
           </w:p>
         </w:tc>
@@ -14838,7 +15905,7 @@
                 <w:sz w:val="14"/>
                 <w:szCs w:val="14"/>
               </w:rPr>
-              <w:t>{{ etx_air_wk_of }}</w:t>
+              <w:t xml:space="preserve"/>
             </w:r>
           </w:p>
         </w:tc>
@@ -14871,7 +15938,7 @@
                 <w:sz w:val="14"/>
                 <w:szCs w:val="14"/>
               </w:rPr>
-              <w:t>{{ id_air_wk_of }}</w:t>
+              <w:t xml:space="preserve"/>
             </w:r>
           </w:p>
         </w:tc>
@@ -14953,7 +16020,7 @@
                 <w:sz w:val="14"/>
                 <w:szCs w:val="14"/>
               </w:rPr>
-              <w:t>{{ cr_suit }}</w:t>
+              <w:t xml:space="preserve"/>
             </w:r>
             <w:r>
               <w:rPr>
@@ -14975,7 +16042,7 @@
                 <w:sz w:val="14"/>
                 <w:szCs w:val="14"/>
               </w:rPr>
-              <w:t>{{ cr_id }}</w:t>
+              <w:t xml:space="preserve"/>
             </w:r>
           </w:p>
         </w:tc>
@@ -15012,7 +16079,6 @@
                 <w:sz w:val="14"/>
                 <w:szCs w:val="14"/>
               </w:rPr>
-              <w:lastRenderedPageBreak/>
               <w:t>Surface Sampling of Cleanrooms</w:t>
             </w:r>
           </w:p>
@@ -15079,7 +16145,7 @@
                 <w:sz w:val="14"/>
                 <w:szCs w:val="14"/>
               </w:rPr>
-              <w:t>{{ date_of_weekly }}</w:t>
+              <w:t xml:space="preserve"/>
             </w:r>
           </w:p>
         </w:tc>
@@ -15112,7 +16178,7 @@
                 <w:sz w:val="14"/>
                 <w:szCs w:val="14"/>
               </w:rPr>
-              <w:t>{{ weekly_initial }}</w:t>
+              <w:t xml:space="preserve"/>
             </w:r>
           </w:p>
         </w:tc>
@@ -15145,7 +16211,7 @@
                 <w:sz w:val="14"/>
                 <w:szCs w:val="14"/>
               </w:rPr>
-              <w:t>{{ obs_room_wk_of }}</w:t>
+              <w:t xml:space="preserve"/>
             </w:r>
           </w:p>
         </w:tc>
@@ -15178,7 +16244,7 @@
                 <w:sz w:val="14"/>
                 <w:szCs w:val="14"/>
               </w:rPr>
-              <w:t>{{ etx_room_wk_of }}</w:t>
+              <w:t xml:space="preserve"/>
             </w:r>
           </w:p>
         </w:tc>
@@ -15211,7 +16277,7 @@
                 <w:sz w:val="14"/>
                 <w:szCs w:val="14"/>
               </w:rPr>
-              <w:t>{{ id_room_wk_of }}</w:t>
+              <w:t xml:space="preserve"/>
             </w:r>
           </w:p>
         </w:tc>
@@ -15421,7 +16487,7 @@
               <wp:inline distT="0" distB="0" distL="0" distR="0" wp14:anchorId="348BA9B0" wp14:editId="6ABE26BC">
                 <wp:extent cx="2886323" cy="932812"/>
                 <wp:effectExtent l="0" t="0" r="0" b="1270"/>
-                <wp:docPr id="1" name="Picture 1" descr="Logo&#10;&#10;Description automatically generated"/>
+                <wp:docPr id="753626938" name="Picture 753626938" descr="Logo&#10;&#10;Description automatically generated"/>
                 <wp:cNvGraphicFramePr>
                   <a:graphicFrameLocks xmlns:a="http://schemas.openxmlformats.org/drawingml/2006/main" noChangeAspect="1"/>
                 </wp:cNvGraphicFramePr>
@@ -16009,7 +17075,7 @@
         <w:sz w:val="22"/>
         <w:szCs w:val="22"/>
       </w:rPr>
-      <w:t>{{ oos_id }}</w:t>
+      <w:t xml:space="preserve"/>
     </w:r>
   </w:p>
 </w:hdr>
@@ -17560,7 +18626,7 @@
   <w:style w:type="paragraph" w:default="1" w:styleId="Normal">
     <w:name w:val="Normal"/>
     <w:qFormat/>
-    <w:rsid w:val="00C477F9"/>
+    <w:rsid w:val="00D906BA"/>
     <w:pPr>
       <w:spacing w:after="0" w:line="240" w:lineRule="auto"/>
     </w:pPr>

</xml_diff>

<commit_message>
feat(cleanroom): add L-Suite rooms and BSC ID mappings with custom narratives
</commit_message>
<xml_diff>
--- a/USP71 OOS P1 template.docx
+++ b/USP71 OOS P1 template.docx
@@ -178,7 +178,7 @@
                 <w:sz w:val="22"/>
                 <w:szCs w:val="22"/>
               </w:rPr>
-              <w:t xml:space="preserve"/>
+              <w:t xml:space="preserve">{{ analyst_name }}</w:t>
             </w:r>
           </w:p>
           <w:p>
@@ -263,7 +263,7 @@
                 <w:sz w:val="22"/>
                 <w:szCs w:val="22"/>
               </w:rPr>
-              <w:t xml:space="preserve"/>
+              <w:t xml:space="preserve">{{ process_date }}</w:t>
             </w:r>
           </w:p>
           <w:p>
@@ -328,7 +328,7 @@
                 <w:sz w:val="22"/>
                 <w:szCs w:val="22"/>
               </w:rPr>
-              <w:t xml:space="preserve"/>
+              <w:t xml:space="preserve">{{ test_date }}</w:t>
             </w:r>
           </w:p>
           <w:bookmarkEnd w:id="0"/>
@@ -396,7 +396,7 @@
                 <w:sz w:val="22"/>
                 <w:szCs w:val="22"/>
               </w:rPr>
-              <w:t xml:space="preserve"/>
+              <w:t xml:space="preserve">{{ test_date }}</w:t>
             </w:r>
           </w:p>
           <w:p>
@@ -516,7 +516,7 @@
                 <w:sz w:val="22"/>
                 <w:szCs w:val="22"/>
               </w:rPr>
-              <w:t xml:space="preserve"/>
+              <w:t xml:space="preserve">{{ sample_id }}</w:t>
             </w:r>
           </w:p>
           <w:bookmarkEnd w:id="1"/>
@@ -551,7 +551,7 @@
                 <w:szCs w:val="22"/>
                 <w:lang w:eastAsia="zh-CN"/>
               </w:rPr>
-              <w:t xml:space="preserve"/>
+              <w:t xml:space="preserve">{{ client_name }}</w:t>
             </w:r>
           </w:p>
         </w:tc>
@@ -629,7 +629,7 @@
                 <w:sz w:val="22"/>
                 <w:szCs w:val="22"/>
               </w:rPr>
-              <w:t xml:space="preserve"/>
+              <w:t xml:space="preserve">{{ prepper_name }}</w:t>
             </w:r>
             <w:r>
               <w:rPr>
@@ -656,7 +656,7 @@
                 <w:sz w:val="22"/>
                 <w:szCs w:val="22"/>
               </w:rPr>
-              <w:t xml:space="preserve">)</w:t>
+              <w:t xml:space="preserve">{{ prepper_initial }})</w:t>
             </w:r>
           </w:p>
           <w:p>
@@ -706,7 +706,7 @@
                 <w:sz w:val="22"/>
                 <w:szCs w:val="22"/>
               </w:rPr>
-              <w:t xml:space="preserve"/>
+              <w:t xml:space="preserve">{{ analyst_name }}</w:t>
             </w:r>
             <w:r>
               <w:rPr>
@@ -724,7 +724,7 @@
                 <w:sz w:val="22"/>
                 <w:szCs w:val="22"/>
               </w:rPr>
-              <w:t xml:space="preserve">)</w:t>
+              <w:t xml:space="preserve">{{ analyst_initial }})</w:t>
             </w:r>
           </w:p>
           <w:p>
@@ -779,7 +779,7 @@
               </w:rPr>
             </w:pPr>
             <w:r>
-              <w:t xml:space="preserve"> ()</w:t>
+              <w:t xml:space="preserve">{{ subculture_name }} ({{ subculture_initial }})</w:t>
             </w:r>
           </w:p>
           <w:p>
@@ -861,7 +861,7 @@
                 <w:sz w:val="22"/>
                 <w:szCs w:val="22"/>
               </w:rPr>
-              <w:t xml:space="preserve"/>
+              <w:t xml:space="preserve">{{ reading_name }}</w:t>
             </w:r>
             <w:r>
               <w:rPr>
@@ -889,7 +889,7 @@
                 <w:sz w:val="22"/>
                 <w:szCs w:val="22"/>
               </w:rPr>
-              <w:t xml:space="preserve">)</w:t>
+              <w:t xml:space="preserve">{{ reading_initial }})</w:t>
             </w:r>
           </w:p>
         </w:tc>
@@ -942,7 +942,7 @@
                 <w:sz w:val="22"/>
                 <w:szCs w:val="22"/>
               </w:rPr>
-              <w:t xml:space="preserve"/>
+              <w:t xml:space="preserve">{{ sample_name }}</w:t>
             </w:r>
           </w:p>
         </w:tc>
@@ -997,7 +997,7 @@
                 <w:sz w:val="22"/>
                 <w:szCs w:val="22"/>
               </w:rPr>
-              <w:t xml:space="preserve"/>
+              <w:t xml:space="preserve">{{ lot_number }}</w:t>
             </w:r>
           </w:p>
         </w:tc>
@@ -1091,7 +1091,7 @@
                 <w:sz w:val="22"/>
                 <w:szCs w:val="22"/>
               </w:rPr>
-              <w:t xml:space="preserve"/>
+              <w:t xml:space="preserve">{{ dosage_form }}</w:t>
             </w:r>
           </w:p>
         </w:tc>
@@ -1199,7 +1199,7 @@
               </w:rPr>
             </w:pPr>
             <w:r>
-              <w:t xml:space="preserve">On , sample  was found positive for viable microorganisms after USP &lt;71&gt; sterility testing. </w:t>
+              <w:t xml:space="preserve">On {{ test_date }}, sample {{ sample_id }} was found positive for viable microorganisms after USP &lt;71&gt; sterility testing. </w:t>
             </w:r>
           </w:p>
           <w:p>
@@ -1833,7 +1833,7 @@
                 <w:sz w:val="22"/>
                 <w:szCs w:val="22"/>
               </w:rPr>
-              <w:t xml:space="preserve"/>
+              <w:t xml:space="preserve">{{ test_date }}</w:t>
             </w:r>
           </w:p>
           <w:p>
@@ -2429,6 +2429,24 @@
                 <w:sz w:val="22"/>
                 <w:szCs w:val="22"/>
               </w:rPr>
+              <w:t xml:space="preserve">{{ prepper_name }}, </w:t>
+            </w:r>
+            <w:r>
+              <w:rPr>
+                <w:rFonts w:ascii="Times New Roman" w:hAnsi="Times New Roman"/>
+                <w:bCs/>
+                <w:sz w:val="22"/>
+                <w:szCs w:val="22"/>
+              </w:rPr>
+              <w:t xml:space="preserve">{{ analyst_name }}</w:t>
+            </w:r>
+            <w:r>
+              <w:rPr>
+                <w:rFonts w:ascii="Times New Roman" w:hAnsi="Times New Roman"/>
+                <w:bCs/>
+                <w:sz w:val="22"/>
+                <w:szCs w:val="22"/>
+              </w:rPr>
               <w:t xml:space="preserve">, </w:t>
             </w:r>
             <w:r>
@@ -2438,44 +2456,26 @@
                 <w:sz w:val="22"/>
                 <w:szCs w:val="22"/>
               </w:rPr>
-              <w:t xml:space="preserve"/>
-            </w:r>
-            <w:r>
-              <w:rPr>
-                <w:rFonts w:ascii="Times New Roman" w:hAnsi="Times New Roman"/>
-                <w:bCs/>
-                <w:sz w:val="22"/>
-                <w:szCs w:val="22"/>
+              <w:t xml:space="preserve">{{ subculture_name }}</w:t>
+            </w:r>
+            <w:r>
+              <w:rPr>
+                <w:rFonts w:ascii="Times New Roman" w:eastAsiaTheme="minorEastAsia" w:hAnsi="Times New Roman" w:hint="eastAsia"/>
+                <w:bCs/>
+                <w:sz w:val="22"/>
+                <w:szCs w:val="22"/>
+                <w:lang w:eastAsia="zh-CN"/>
               </w:rPr>
               <w:t xml:space="preserve">, </w:t>
             </w:r>
             <w:r>
               <w:rPr>
-                <w:rFonts w:ascii="Times New Roman" w:hAnsi="Times New Roman"/>
-                <w:bCs/>
-                <w:sz w:val="22"/>
-                <w:szCs w:val="22"/>
-              </w:rPr>
-              <w:t xml:space="preserve"/>
-            </w:r>
-            <w:r>
-              <w:rPr>
                 <w:rFonts w:ascii="Times New Roman" w:eastAsiaTheme="minorEastAsia" w:hAnsi="Times New Roman" w:hint="eastAsia"/>
                 <w:bCs/>
                 <w:sz w:val="22"/>
                 <w:szCs w:val="22"/>
                 <w:lang w:eastAsia="zh-CN"/>
               </w:rPr>
-              <w:t xml:space="preserve">, </w:t>
-            </w:r>
-            <w:r>
-              <w:rPr>
-                <w:rFonts w:ascii="Times New Roman" w:eastAsiaTheme="minorEastAsia" w:hAnsi="Times New Roman" w:hint="eastAsia"/>
-                <w:bCs/>
-                <w:sz w:val="22"/>
-                <w:szCs w:val="22"/>
-                <w:lang w:eastAsia="zh-CN"/>
-              </w:rPr>
               <w:t xml:space="preserve">and </w:t>
             </w:r>
             <w:r>
@@ -2485,7 +2485,7 @@
                 <w:sz w:val="22"/>
                 <w:szCs w:val="22"/>
               </w:rPr>
-              <w:t xml:space="preserve"> </w:t>
+              <w:t xml:space="preserve">{{ reading_name }} </w:t>
             </w:r>
             <w:bookmarkEnd w:id="5"/>
             <w:bookmarkEnd w:id="6"/>
@@ -2787,7 +2787,7 @@
                 <w:sz w:val="22"/>
                 <w:szCs w:val="22"/>
               </w:rPr>
-              <w:t xml:space="preserve"/>
+              <w:t xml:space="preserve">{{ sample_id }}</w:t>
             </w:r>
             <w:r>
               <w:rPr>
@@ -3634,7 +3634,7 @@
                 <w:sz w:val="22"/>
                 <w:szCs w:val="22"/>
               </w:rPr>
-              <w:t xml:space="preserve"/>
+              <w:t xml:space="preserve">{{ sample_id }}</w:t>
             </w:r>
           </w:p>
         </w:tc>
@@ -4729,7 +4729,7 @@
                 <w:sz w:val="22"/>
                 <w:szCs w:val="22"/>
               </w:rPr>
-              <w:t xml:space="preserve"/>
+              <w:t xml:space="preserve">{{ sample_id }}</w:t>
             </w:r>
           </w:p>
         </w:tc>
@@ -7457,7 +7457,7 @@
                 <w:szCs w:val="22"/>
                 <w:lang w:eastAsia="zh-CN"/>
               </w:rPr>
-              <w:t xml:space="preserve"/>
+              <w:t xml:space="preserve">{{ bsc_id }}</w:t>
             </w:r>
           </w:p>
         </w:tc>
@@ -7743,59 +7743,8 @@
               </w:rPr>
             </w:pPr>
             <w:r>
-              <w:rPr>
-                <w:rFonts w:ascii="Times New Roman" w:hAnsi="Times New Roman"/>
-                <w:sz w:val="22"/>
-                <w:szCs w:val="22"/>
-              </w:rPr>
-              <w:t>E00</w:t>
-            </w:r>
-            <w:bookmarkStart w:id="11" w:name="OLE_LINK6"/>
-            <w:r>
-              <w:rPr>
-                <w:rFonts w:ascii="Times New Roman" w:hAnsi="Times New Roman"/>
-                <w:sz w:val="22"/>
-                <w:szCs w:val="22"/>
-              </w:rPr>
-              <w:t xml:space="preserve"/>
-            </w:r>
-            <w:bookmarkEnd w:id="11"/>
-            <w:r>
-              <w:rPr>
-                <w:rFonts w:ascii="Times New Roman" w:hAnsi="Times New Roman"/>
-                <w:sz w:val="22"/>
-                <w:szCs w:val="22"/>
-              </w:rPr>
-              <w:t xml:space="preserve"> </w:t>
-            </w:r>
-            <w:bookmarkStart w:id="12" w:name="OLE_LINK7"/>
-            <w:r>
-              <w:rPr>
-                <w:rFonts w:ascii="Times New Roman" w:hAnsi="Times New Roman"/>
-                <w:sz w:val="22"/>
-                <w:szCs w:val="22"/>
-              </w:rPr>
-              <w:t>(CR</w:t>
-            </w:r>
-            <w:bookmarkStart w:id="13" w:name="OLE_LINK14"/>
-            <w:r>
-              <w:rPr>
-                <w:rFonts w:ascii="Times New Roman" w:hAnsi="Times New Roman"/>
-                <w:sz w:val="22"/>
-                <w:szCs w:val="22"/>
-              </w:rPr>
-              <w:t xml:space="preserve"/>
-            </w:r>
-            <w:bookmarkEnd w:id="13"/>
-            <w:r>
-              <w:rPr>
-                <w:rFonts w:ascii="Times New Roman" w:hAnsi="Times New Roman"/>
-                <w:sz w:val="22"/>
-                <w:szCs w:val="22"/>
-              </w:rPr>
-              <w:t>)</w:t>
-            </w:r>
-            <w:bookmarkEnd w:id="12"/>
+              <w:t xml:space="preserve">E00{{ cr_id }} ({% if cr_suit == 'L-Suite' %}L-Suite{% else %}CR{{ cr_suit }}{% endif %})</w:t>
+            </w:r>
           </w:p>
           <w:p>
             <w:pPr>
@@ -10681,7 +10630,7 @@
                 <w:szCs w:val="22"/>
                 <w:lang w:eastAsia="zh-CN"/>
               </w:rPr>
-              <w:t xml:space="preserve">All the analysts involved in the testing, the processing analyst () and the reading analyst who confirmed the positive result (), were interviewed comprehensively. Their answers are recorded throughout this document. </w:t>
+              <w:t xml:space="preserve">All the analysts involved in the testing, the processing analyst ({{ analyst_name }}) and the reading analyst who confirmed the positive result ({{ reading_name }}), were interviewed comprehensively. Their answers are recorded throughout this document. </w:t>
             </w:r>
           </w:p>
           <w:p>
@@ -10715,7 +10664,7 @@
                 <w:szCs w:val="22"/>
                 <w:lang w:eastAsia="zh-CN"/>
               </w:rPr>
-              <w:t xml:space="preserve">Upon arrival, the sample was stored in accordance with the Client’s instructions. Analyst  verified the sample’s integrity throughout both the preparation and processing stages. No leaks or turbidity were observed at any point, verifying the integrity of the sample.</w:t>
+              <w:t xml:space="preserve">Upon arrival, the sample was stored in accordance with the Client’s instructions. Analyst {{ prepper_name }} verified the sample’s integrity throughout both the preparation and processing stages. No leaks or turbidity were observed at any point, verifying the integrity of the sample.</w:t>
             </w:r>
           </w:p>
           <w:p>
@@ -10783,7 +10732,7 @@
                 <w:szCs w:val="22"/>
                 <w:lang w:eastAsia="zh-CN"/>
               </w:rPr>
-              <w:t xml:space="preserve"/>
+              <w:t xml:space="preserve">{{ equipment_summary }}</w:t>
             </w:r>
           </w:p>
           <w:p>
@@ -10817,7 +10766,7 @@
                 <w:szCs w:val="22"/>
                 <w:lang w:eastAsia="zh-CN"/>
               </w:rPr>
-              <w:t xml:space="preserve">On , the sample vials for  were received from the Sample Submissions team and brought into the Sterile Microbiology lab. Upon arrival, each sample vial was sprayed with an acidified bleach disinfectant, placed into pre-disinfected bins, and allowed a 10-minute contact time. The secondary disinfection happened in the ISO 8 anteroom (Suite )), where the vials were again treated with acidified bleach and provided a 10‑minute contact time before processing. Subsequently, the vials were moved into the ISO 7 cleanroom Suite (). Inside this cleanroom, the processing analyst, , performed a final disinfection step, allowing an additional 10-minute contact time. Once fully disinfected, the vials were transferred into the ISO 5 BSC E00.</w:t>
+              <w:t xml:space="preserve">On {{ received_data }}, the sample vials for {{ sample_id }} were received from the Sample Submissions team and brought into the Sterile Microbiology lab. Upon arrival, each sample vial was sprayed with an acidified bleach disinfectant, placed into pre-disinfected bins, and allowed a 10-minute contact time. The secondary disinfection happened in the ISO 8 anteroom (Suite {{ cr_suit }})), where the vials were again treated with acidified bleach and provided a 10‑minute contact time before processing. Subsequently, the vials were moved into the ISO 7 cleanroom Suite {{ cr_suit }}({{ suit }}). Inside this cleanroom, the processing analyst, {{ analyst_name }}, performed a final disinfection step, allowing an additional 10-minute contact time. Once fully disinfected, the vials were transferred into the ISO 5 BSC E00{{ bsc_id }}.</w:t>
             </w:r>
           </w:p>
           <w:p>
@@ -10851,7 +10800,7 @@
                 <w:szCs w:val="22"/>
                 <w:lang w:eastAsia="zh-CN"/>
               </w:rPr>
-              <w:t xml:space="preserve">Once transferred into the ISO 5 BSC, the vials were placed on the disinfected working surface of the BSC E00 and aseptically opened and tested in accordance with SOP 2.600.008 (USP / EP 2.6.1 Sterility Test). Following testing, the media bottles were subsequently transferred into designated incubators, E001356 and E001357, to initiate incubation. </w:t>
+              <w:t xml:space="preserve">Once transferred into the ISO 5 BSC, the vials were placed on the disinfected working surface of the BSC E00{{ bsc_id }} and aseptically opened and tested in accordance with SOP 2.600.008 (USP / EP 2.6.1 Sterility Test). Following testing, the media bottles were subsequently transferred into designated incubators, E001356 and E001357, to initiate incubation. </w:t>
             </w:r>
           </w:p>
           <w:p>
@@ -10885,7 +10834,7 @@
                 <w:szCs w:val="22"/>
                 <w:lang w:eastAsia="zh-CN"/>
               </w:rPr>
-              <w:t xml:space="preserve">On  (Day  of incubation), microbial growth was observed in  media bottle by analyst  and confirmed by Microbiology Lab Supervisor Robin Seymour. The organism was identified as  (see Table 1).</w:t>
+              <w:t xml:space="preserve">On {{ test_date }} (Day {{ incubation_time }} of incubation), microbial growth was observed in {{ positive_media }} media bottle by analyst {{ reading_name }} and confirmed by Microbiology Lab Supervisor Robin Seymour. The organism was identified as {{ positive_org }} (see Table 1).</w:t>
             </w:r>
           </w:p>
           <w:p>
@@ -10963,7 +10912,7 @@
                 <w:szCs w:val="22"/>
                 <w:lang w:eastAsia="zh-CN"/>
               </w:rPr>
-              <w:t xml:space="preserve"> </w:t>
+              <w:t xml:space="preserve">{{ narrative_summary }} </w:t>
             </w:r>
           </w:p>
           <w:p>
@@ -11031,7 +10980,7 @@
                 <w:szCs w:val="22"/>
                 <w:lang w:eastAsia="zh-CN"/>
               </w:rPr>
-              <w:t xml:space="preserve">Monthly cleaning and disinfection of the outermost ISO 8 Anteroom, the middle ISO 7 Buffer room, the innermost ISO 7 cleanroom, and its containing ISO 5 Biosafety Cabinets for CR  was performed on , as per SOP 2.600.018 (Cleaning and Disinfecting Procedure for Microbiology) During </w:t>
+              <w:t xml:space="preserve">Monthly cleaning and disinfection of the outermost ISO 8 Anteroom, the middle ISO 7 Buffer room, the innermost ISO 7 cleanroom, and its containing ISO 5 Biosafety Cabinets for CR {{ cr_suit }} was performed on {{ monthly_cleaning_date }}, as per SOP 2.600.018 (Cleaning and Disinfecting Procedure for Microbiology) During </w:t>
             </w:r>
             <w:r>
               <w:rPr>
@@ -11042,7 +10991,7 @@
                 <w:lang w:eastAsia="zh-CN"/>
               </w:rPr>
               <w:lastRenderedPageBreak/>
-              <w:t xml:space="preserve">both cleaning cycles, it was documented that all H₂O₂ indicators passed. This confirms the efficient monthly cleaning of all three parts of Cleanrooms . </w:t>
+              <w:t xml:space="preserve">both cleaning cycles, it was documented that all H₂O₂ indicators passed. This confirms the efficient monthly cleaning of all three parts of Cleanrooms {{ cr_suit }}. </w:t>
             </w:r>
           </w:p>
           <w:p>
@@ -11076,7 +11025,7 @@
                 <w:szCs w:val="22"/>
                 <w:lang w:eastAsia="zh-CN"/>
               </w:rPr>
-              <w:t xml:space="preserve"/>
+              <w:t xml:space="preserve">{{ sample_history_paragraph }}</w:t>
             </w:r>
           </w:p>
           <w:p>
@@ -11110,7 +11059,7 @@
                 <w:szCs w:val="22"/>
                 <w:lang w:eastAsia="zh-CN"/>
               </w:rPr>
-              <w:t xml:space="preserve">To assess the potential for sample-to-sample contamination contributing to the positive results, a comprehensive review was conducted of all samples processed on the same day. </w:t>
+              <w:t xml:space="preserve">To assess the potential for sample-to-sample contamination contributing to the positive results, a comprehensive review was conducted of all samples processed on the same day. {{ cross_contamination_summary }}</w:t>
             </w:r>
           </w:p>
           <w:p>
@@ -12182,7 +12131,7 @@
           <w:szCs w:val="18"/>
           <w:u w:val="single"/>
         </w:rPr>
-        <w:t xml:space="preserve"/>
+        <w:t xml:space="preserve">{{ sample_id }}</w:t>
       </w:r>
       <w:r>
         <w:rPr>
@@ -12496,7 +12445,7 @@
                 <w:sz w:val="14"/>
                 <w:szCs w:val="14"/>
               </w:rPr>
-              <w:t xml:space="preserve"/>
+              <w:t xml:space="preserve">{{ analyst_name }}</w:t>
             </w:r>
           </w:p>
         </w:tc>
@@ -12521,7 +12470,7 @@
                 <w:sz w:val="14"/>
                 <w:szCs w:val="14"/>
               </w:rPr>
-              <w:t xml:space="preserve"/>
+              <w:t xml:space="preserve">{{ reader_name }}</w:t>
             </w:r>
           </w:p>
         </w:tc>
@@ -12548,7 +12497,7 @@
                 <w:sz w:val="14"/>
                 <w:szCs w:val="14"/>
               </w:rPr>
-              <w:t xml:space="preserve"/>
+              <w:t xml:space="preserve">{{ sample_id }}</w:t>
             </w:r>
           </w:p>
         </w:tc>
@@ -12574,7 +12523,7 @@
                 <w:sz w:val="14"/>
                 <w:szCs w:val="14"/>
               </w:rPr>
-              <w:t xml:space="preserve"/>
+              <w:t xml:space="preserve">{{ positive_id }}</w:t>
             </w:r>
           </w:p>
         </w:tc>
@@ -12600,7 +12549,7 @@
                 <w:sz w:val="14"/>
                 <w:szCs w:val="14"/>
               </w:rPr>
-              <w:t xml:space="preserve"/>
+              <w:t xml:space="preserve">{{ positive_media }}</w:t>
             </w:r>
           </w:p>
         </w:tc>
@@ -12626,7 +12575,7 @@
                 <w:sz w:val="14"/>
                 <w:szCs w:val="14"/>
               </w:rPr>
-              <w:t xml:space="preserve"/>
+              <w:t xml:space="preserve">{{ positive_org }}</w:t>
             </w:r>
           </w:p>
         </w:tc>
@@ -12705,7 +12654,7 @@
           <w:szCs w:val="18"/>
           <w:u w:val="single"/>
         </w:rPr>
-        <w:t xml:space="preserve"/>
+        <w:t xml:space="preserve">{{ process_date }}</w:t>
       </w:r>
     </w:p>
     <w:p>
@@ -13236,7 +13185,7 @@
                 <w:sz w:val="14"/>
                 <w:szCs w:val="14"/>
               </w:rPr>
-              <w:t xml:space="preserve"/>
+              <w:t xml:space="preserve">{{ test_date }}</w:t>
             </w:r>
           </w:p>
         </w:tc>
@@ -13275,7 +13224,7 @@
                 <w:sz w:val="14"/>
                 <w:szCs w:val="14"/>
               </w:rPr>
-              <w:t xml:space="preserve"/>
+              <w:t xml:space="preserve">{{ analyst_initial }}</w:t>
             </w:r>
           </w:p>
         </w:tc>
@@ -13351,7 +13300,7 @@
                 <w:sz w:val="14"/>
                 <w:szCs w:val="14"/>
               </w:rPr>
-              <w:t xml:space="preserve"/>
+              <w:t xml:space="preserve">{{ obs_pers_dur }}</w:t>
             </w:r>
           </w:p>
         </w:tc>
@@ -13389,7 +13338,7 @@
                 <w:sz w:val="14"/>
                 <w:szCs w:val="14"/>
               </w:rPr>
-              <w:t xml:space="preserve"/>
+              <w:t xml:space="preserve">{{ etx_pers_dur }}</w:t>
             </w:r>
           </w:p>
         </w:tc>
@@ -13426,7 +13375,7 @@
                 <w:sz w:val="14"/>
                 <w:szCs w:val="14"/>
               </w:rPr>
-              <w:t xml:space="preserve"/>
+              <w:t xml:space="preserve">{{ id_pers_dur }}</w:t>
             </w:r>
           </w:p>
         </w:tc>
@@ -13588,7 +13537,7 @@
                 <w:sz w:val="14"/>
                 <w:szCs w:val="14"/>
               </w:rPr>
-              <w:t xml:space="preserve"/>
+              <w:t xml:space="preserve">{{ test_date }}</w:t>
             </w:r>
           </w:p>
         </w:tc>
@@ -13626,7 +13575,7 @@
                 <w:sz w:val="14"/>
                 <w:szCs w:val="14"/>
               </w:rPr>
-              <w:t xml:space="preserve"/>
+              <w:t xml:space="preserve">{{ analyst_initial }}</w:t>
             </w:r>
           </w:p>
         </w:tc>
@@ -13702,7 +13651,7 @@
                 <w:sz w:val="14"/>
                 <w:szCs w:val="14"/>
               </w:rPr>
-              <w:t xml:space="preserve"/>
+              <w:t xml:space="preserve">{{ obs_pers_dur }}</w:t>
             </w:r>
           </w:p>
         </w:tc>
@@ -13740,7 +13689,7 @@
                 <w:sz w:val="14"/>
                 <w:szCs w:val="14"/>
               </w:rPr>
-              <w:t xml:space="preserve"/>
+              <w:t xml:space="preserve">{{ etx_pers_dur }}</w:t>
             </w:r>
           </w:p>
         </w:tc>
@@ -13777,7 +13726,7 @@
                 <w:sz w:val="14"/>
                 <w:szCs w:val="14"/>
               </w:rPr>
-              <w:t xml:space="preserve"/>
+              <w:t xml:space="preserve">{{ id_pers_dur }}</w:t>
             </w:r>
           </w:p>
         </w:tc>
@@ -13879,7 +13828,7 @@
                 <w:sz w:val="14"/>
                 <w:szCs w:val="14"/>
               </w:rPr>
-              <w:t xml:space="preserve"/>
+              <w:t xml:space="preserve">{{ bsc_id }}</w:t>
             </w:r>
             <w:r>
               <w:rPr>
@@ -13975,7 +13924,7 @@
                 <w:sz w:val="14"/>
                 <w:szCs w:val="14"/>
               </w:rPr>
-              <w:t xml:space="preserve"> </w:t>
+              <w:t xml:space="preserve">{{ bsc_id }} </w:t>
             </w:r>
             <w:r>
               <w:rPr>
@@ -14052,7 +14001,7 @@
                 <w:sz w:val="14"/>
                 <w:szCs w:val="14"/>
               </w:rPr>
-              <w:t xml:space="preserve"/>
+              <w:t xml:space="preserve">{{ test_date }}</w:t>
             </w:r>
           </w:p>
         </w:tc>
@@ -14090,7 +14039,7 @@
                 <w:sz w:val="14"/>
                 <w:szCs w:val="14"/>
               </w:rPr>
-              <w:t xml:space="preserve"/>
+              <w:t xml:space="preserve">{{ analyst_initial }}</w:t>
             </w:r>
           </w:p>
         </w:tc>
@@ -14166,7 +14115,7 @@
                 <w:sz w:val="14"/>
                 <w:szCs w:val="14"/>
               </w:rPr>
-              <w:t xml:space="preserve"/>
+              <w:t xml:space="preserve">{{ obs_surf_dur }}</w:t>
             </w:r>
           </w:p>
         </w:tc>
@@ -14204,7 +14153,7 @@
                 <w:sz w:val="14"/>
                 <w:szCs w:val="14"/>
               </w:rPr>
-              <w:t xml:space="preserve"/>
+              <w:t xml:space="preserve">{{ etx_surf_dur }}</w:t>
             </w:r>
           </w:p>
         </w:tc>
@@ -14241,7 +14190,7 @@
                 <w:sz w:val="14"/>
                 <w:szCs w:val="14"/>
               </w:rPr>
-              <w:t xml:space="preserve"/>
+              <w:t xml:space="preserve">{{ id_surf_dur }}</w:t>
             </w:r>
           </w:p>
         </w:tc>
@@ -14437,7 +14386,7 @@
                 <w:sz w:val="14"/>
                 <w:szCs w:val="14"/>
               </w:rPr>
-              <w:t xml:space="preserve"/>
+              <w:t xml:space="preserve">{{ test_date }}</w:t>
             </w:r>
           </w:p>
         </w:tc>
@@ -14475,7 +14424,7 @@
                 <w:sz w:val="14"/>
                 <w:szCs w:val="14"/>
               </w:rPr>
-              <w:t xml:space="preserve"/>
+              <w:t xml:space="preserve">{{ aliquoting_initial }}</w:t>
             </w:r>
           </w:p>
         </w:tc>
@@ -14551,7 +14500,7 @@
                 <w:sz w:val="14"/>
                 <w:szCs w:val="14"/>
               </w:rPr>
-              <w:t xml:space="preserve"/>
+              <w:t xml:space="preserve">{{ obs_surf_dur }}</w:t>
             </w:r>
           </w:p>
         </w:tc>
@@ -14589,7 +14538,7 @@
                 <w:sz w:val="14"/>
                 <w:szCs w:val="14"/>
               </w:rPr>
-              <w:t xml:space="preserve"/>
+              <w:t xml:space="preserve">{{ etx_surf_dur }}</w:t>
             </w:r>
           </w:p>
         </w:tc>
@@ -14626,7 +14575,7 @@
                 <w:sz w:val="14"/>
                 <w:szCs w:val="14"/>
               </w:rPr>
-              <w:t xml:space="preserve"/>
+              <w:t xml:space="preserve">{{ id_surf_dur }}</w:t>
             </w:r>
           </w:p>
         </w:tc>
@@ -14721,7 +14670,7 @@
                 <w:sz w:val="14"/>
                 <w:szCs w:val="14"/>
               </w:rPr>
-              <w:t xml:space="preserve"> </w:t>
+              <w:t xml:space="preserve">{{ bsc_id }} </w:t>
             </w:r>
             <w:r>
               <w:rPr>
@@ -14798,7 +14747,7 @@
                 <w:sz w:val="14"/>
                 <w:szCs w:val="14"/>
               </w:rPr>
-              <w:t xml:space="preserve"/>
+              <w:t xml:space="preserve">{{ test_date }}</w:t>
             </w:r>
           </w:p>
         </w:tc>
@@ -14836,7 +14785,7 @@
                 <w:sz w:val="14"/>
                 <w:szCs w:val="14"/>
               </w:rPr>
-              <w:t xml:space="preserve"/>
+              <w:t xml:space="preserve">{{ analyst_initial }}</w:t>
             </w:r>
           </w:p>
         </w:tc>
@@ -14912,7 +14861,7 @@
                 <w:sz w:val="14"/>
                 <w:szCs w:val="14"/>
               </w:rPr>
-              <w:t xml:space="preserve"/>
+              <w:t xml:space="preserve">{{ obs_sett_dur }}</w:t>
             </w:r>
           </w:p>
         </w:tc>
@@ -14950,7 +14899,7 @@
                 <w:sz w:val="14"/>
                 <w:szCs w:val="14"/>
               </w:rPr>
-              <w:t xml:space="preserve"/>
+              <w:t xml:space="preserve">{{ etx_sett_dur }}</w:t>
             </w:r>
           </w:p>
         </w:tc>
@@ -14987,7 +14936,7 @@
                 <w:sz w:val="14"/>
                 <w:szCs w:val="14"/>
               </w:rPr>
-              <w:t xml:space="preserve"/>
+              <w:t xml:space="preserve">{{ id_sett_dur }}</w:t>
             </w:r>
           </w:p>
         </w:tc>
@@ -15156,7 +15105,7 @@
                 <w:sz w:val="14"/>
                 <w:szCs w:val="14"/>
               </w:rPr>
-              <w:t xml:space="preserve"/>
+              <w:t xml:space="preserve">{{ test_date }}</w:t>
             </w:r>
           </w:p>
         </w:tc>
@@ -15194,7 +15143,7 @@
                 <w:sz w:val="14"/>
                 <w:szCs w:val="14"/>
               </w:rPr>
-              <w:t xml:space="preserve"/>
+              <w:t xml:space="preserve">{{ aliquoting_initial }}</w:t>
             </w:r>
           </w:p>
         </w:tc>
@@ -15270,7 +15219,7 @@
                 <w:sz w:val="14"/>
                 <w:szCs w:val="14"/>
               </w:rPr>
-              <w:t xml:space="preserve"/>
+              <w:t xml:space="preserve">{{ obs_sett_dur }}</w:t>
             </w:r>
           </w:p>
         </w:tc>
@@ -15308,7 +15257,7 @@
                 <w:sz w:val="14"/>
                 <w:szCs w:val="14"/>
               </w:rPr>
-              <w:t xml:space="preserve"/>
+              <w:t xml:space="preserve">{{ etx_sett_dur }}</w:t>
             </w:r>
           </w:p>
         </w:tc>
@@ -15345,7 +15294,7 @@
                 <w:sz w:val="14"/>
                 <w:szCs w:val="14"/>
               </w:rPr>
-              <w:t xml:space="preserve"/>
+              <w:t xml:space="preserve">{{ id_sett_dur }}</w:t>
             </w:r>
           </w:p>
         </w:tc>
@@ -15432,7 +15381,7 @@
                 <w:sz w:val="14"/>
                 <w:szCs w:val="14"/>
               </w:rPr>
-              <w:t xml:space="preserve"/>
+              <w:t xml:space="preserve">{{ cr_suit }}</w:t>
             </w:r>
             <w:r>
               <w:rPr>
@@ -15454,7 +15403,7 @@
                 <w:sz w:val="14"/>
                 <w:szCs w:val="14"/>
               </w:rPr>
-              <w:t xml:space="preserve"/>
+              <w:t xml:space="preserve">{{ cr_id }}</w:t>
             </w:r>
           </w:p>
         </w:tc>
@@ -15806,7 +15755,7 @@
                 <w:sz w:val="14"/>
                 <w:szCs w:val="14"/>
               </w:rPr>
-              <w:t xml:space="preserve"/>
+              <w:t xml:space="preserve">{{ date_of_weekly }}</w:t>
             </w:r>
           </w:p>
         </w:tc>
@@ -15839,7 +15788,7 @@
                 <w:sz w:val="14"/>
                 <w:szCs w:val="14"/>
               </w:rPr>
-              <w:t xml:space="preserve"/>
+              <w:t xml:space="preserve">{{ weekly_initial }}</w:t>
             </w:r>
           </w:p>
         </w:tc>
@@ -15872,7 +15821,7 @@
                 <w:sz w:val="14"/>
                 <w:szCs w:val="14"/>
               </w:rPr>
-              <w:t xml:space="preserve"/>
+              <w:t xml:space="preserve">{{ obs_air_wk_of }}</w:t>
             </w:r>
           </w:p>
         </w:tc>
@@ -15905,7 +15854,7 @@
                 <w:sz w:val="14"/>
                 <w:szCs w:val="14"/>
               </w:rPr>
-              <w:t xml:space="preserve"/>
+              <w:t xml:space="preserve">{{ etx_air_wk_of }}</w:t>
             </w:r>
           </w:p>
         </w:tc>
@@ -15938,7 +15887,7 @@
                 <w:sz w:val="14"/>
                 <w:szCs w:val="14"/>
               </w:rPr>
-              <w:t xml:space="preserve"/>
+              <w:t xml:space="preserve">{{ id_air_wk_of }}</w:t>
             </w:r>
           </w:p>
         </w:tc>
@@ -16020,7 +15969,7 @@
                 <w:sz w:val="14"/>
                 <w:szCs w:val="14"/>
               </w:rPr>
-              <w:t xml:space="preserve"/>
+              <w:t xml:space="preserve">{{ cr_suit }}</w:t>
             </w:r>
             <w:r>
               <w:rPr>
@@ -16042,7 +15991,7 @@
                 <w:sz w:val="14"/>
                 <w:szCs w:val="14"/>
               </w:rPr>
-              <w:t xml:space="preserve"/>
+              <w:t xml:space="preserve">{{ cr_id }}</w:t>
             </w:r>
           </w:p>
         </w:tc>
@@ -16145,7 +16094,7 @@
                 <w:sz w:val="14"/>
                 <w:szCs w:val="14"/>
               </w:rPr>
-              <w:t xml:space="preserve"/>
+              <w:t xml:space="preserve">{{ date_of_weekly }}</w:t>
             </w:r>
           </w:p>
         </w:tc>
@@ -16178,7 +16127,7 @@
                 <w:sz w:val="14"/>
                 <w:szCs w:val="14"/>
               </w:rPr>
-              <w:t xml:space="preserve"/>
+              <w:t xml:space="preserve">{{ weekly_initial }}</w:t>
             </w:r>
           </w:p>
         </w:tc>
@@ -16211,7 +16160,7 @@
                 <w:sz w:val="14"/>
                 <w:szCs w:val="14"/>
               </w:rPr>
-              <w:t xml:space="preserve"/>
+              <w:t xml:space="preserve">{{ obs_room_wk_of }}</w:t>
             </w:r>
           </w:p>
         </w:tc>
@@ -16244,7 +16193,7 @@
                 <w:sz w:val="14"/>
                 <w:szCs w:val="14"/>
               </w:rPr>
-              <w:t xml:space="preserve"/>
+              <w:t xml:space="preserve">{{ etx_room_wk_of }}</w:t>
             </w:r>
           </w:p>
         </w:tc>
@@ -16277,7 +16226,7 @@
                 <w:sz w:val="14"/>
                 <w:szCs w:val="14"/>
               </w:rPr>
-              <w:t xml:space="preserve"/>
+              <w:t xml:space="preserve">{{ id_room_wk_of }}</w:t>
             </w:r>
           </w:p>
         </w:tc>

</xml_diff>